<commit_message>
inclusão de explicação dos clusters
</commit_message>
<xml_diff>
--- a/Respostas.docx
+++ b/Respostas.docx
@@ -1024,23 +1024,7 @@
             <w:sz w:val="24"/>
             <w:szCs w:val="24"/>
           </w:rPr>
-          <w:t>Reposit</w:t>
-        </w:r>
-        <w:r>
-          <w:rPr>
-            <w:rStyle w:val="Hyperlink"/>
-            <w:sz w:val="24"/>
-            <w:szCs w:val="24"/>
-          </w:rPr>
-          <w:t>ó</w:t>
-        </w:r>
-        <w:r>
-          <w:rPr>
-            <w:rStyle w:val="Hyperlink"/>
-            <w:sz w:val="24"/>
-            <w:szCs w:val="24"/>
-          </w:rPr>
-          <w:t xml:space="preserve">rio do </w:t>
+          <w:t xml:space="preserve">Repositório do </w:t>
         </w:r>
         <w:r>
           <w:rPr>
@@ -1068,23 +1052,7 @@
             <w:sz w:val="24"/>
             <w:szCs w:val="24"/>
           </w:rPr>
-          <w:t>https://github.com/BrunoBersan/unsupervised_</w:t>
-        </w:r>
-        <w:r>
-          <w:rPr>
-            <w:rStyle w:val="Hyperlink"/>
-            <w:sz w:val="24"/>
-            <w:szCs w:val="24"/>
-          </w:rPr>
-          <w:t>l</w:t>
-        </w:r>
-        <w:r>
-          <w:rPr>
-            <w:rStyle w:val="Hyperlink"/>
-            <w:sz w:val="24"/>
-            <w:szCs w:val="24"/>
-          </w:rPr>
-          <w:t>earning_validation</w:t>
+          <w:t>https://github.com/BrunoBersan/unsupervised_learning_validation</w:t>
         </w:r>
       </w:hyperlink>
     </w:p>
@@ -8380,6 +8348,2169 @@
         <w:t>Essa abordagem é útil quando o formato geral das séries é mais importante do que o alinhamento exato no tempo, permitindo identificar similaridade mesmo com velocidades ou durações diferentes.</w:t>
       </w:r>
     </w:p>
+    <w:p>
+      <w:pPr>
+        <w:pStyle w:val="PargrafodaLista"/>
+        <w:ind w:left="0"/>
+        <w:jc w:val="both"/>
+        <w:rPr>
+          <w:sz w:val="24"/>
+          <w:szCs w:val="24"/>
+        </w:rPr>
+      </w:pPr>
+      <w:r>
+        <w:rPr>
+          <w:b/>
+          <w:bCs/>
+          <w:sz w:val="24"/>
+          <w:szCs w:val="24"/>
+        </w:rPr>
+        <w:lastRenderedPageBreak/>
+        <w:t>Base utilizada:</w:t>
+      </w:r>
+      <w:r>
+        <w:rPr>
+          <w:sz w:val="24"/>
+          <w:szCs w:val="24"/>
+        </w:rPr>
+        <w:t xml:space="preserve"> Country Data – </w:t>
+      </w:r>
+      <w:proofErr w:type="spellStart"/>
+      <w:r>
+        <w:rPr>
+          <w:sz w:val="24"/>
+          <w:szCs w:val="24"/>
+        </w:rPr>
+        <w:t>Kaggle</w:t>
+      </w:r>
+      <w:proofErr w:type="spellEnd"/>
+      <w:r>
+        <w:rPr>
+          <w:sz w:val="24"/>
+          <w:szCs w:val="24"/>
+        </w:rPr>
+        <w:t xml:space="preserve"> (167 países, variáveis socioeconômicas e de saúde).</w:t>
+      </w:r>
+      <w:r>
+        <w:rPr>
+          <w:sz w:val="24"/>
+          <w:szCs w:val="24"/>
+        </w:rPr>
+        <w:br/>
+      </w:r>
+      <w:r>
+        <w:rPr>
+          <w:b/>
+          <w:bCs/>
+          <w:sz w:val="24"/>
+          <w:szCs w:val="24"/>
+        </w:rPr>
+        <w:t>Método:</w:t>
+      </w:r>
+      <w:r>
+        <w:rPr>
+          <w:sz w:val="24"/>
+          <w:szCs w:val="24"/>
+        </w:rPr>
+        <w:t xml:space="preserve"> K-</w:t>
+      </w:r>
+      <w:proofErr w:type="spellStart"/>
+      <w:r>
+        <w:rPr>
+          <w:sz w:val="24"/>
+          <w:szCs w:val="24"/>
+        </w:rPr>
+        <w:t>Means</w:t>
+      </w:r>
+      <w:proofErr w:type="spellEnd"/>
+      <w:r>
+        <w:rPr>
+          <w:sz w:val="24"/>
+          <w:szCs w:val="24"/>
+        </w:rPr>
+        <w:t xml:space="preserve">, com </w:t>
+      </w:r>
+      <w:r>
+        <w:rPr>
+          <w:b/>
+          <w:bCs/>
+          <w:sz w:val="24"/>
+          <w:szCs w:val="24"/>
+        </w:rPr>
+        <w:t>k = 5</w:t>
+      </w:r>
+      <w:r>
+        <w:rPr>
+          <w:sz w:val="24"/>
+          <w:szCs w:val="24"/>
+        </w:rPr>
+        <w:t xml:space="preserve"> escolhido via silhueta, CH e DB</w:t>
+      </w:r>
+      <w:r>
+        <w:rPr>
+          <w:sz w:val="24"/>
+          <w:szCs w:val="24"/>
+        </w:rPr>
+        <w:t>.</w:t>
+      </w:r>
+    </w:p>
+    <w:p>
+      <w:pPr>
+        <w:pStyle w:val="PargrafodaLista"/>
+        <w:ind w:left="0"/>
+        <w:jc w:val="both"/>
+        <w:rPr>
+          <w:sz w:val="24"/>
+          <w:szCs w:val="24"/>
+        </w:rPr>
+      </w:pPr>
+      <w:r>
+        <w:rPr>
+          <w:sz w:val="24"/>
+          <w:szCs w:val="24"/>
+        </w:rPr>
+        <w:t xml:space="preserve">A seguir, apresento a </w:t>
+      </w:r>
+      <w:r>
+        <w:rPr>
+          <w:b/>
+          <w:bCs/>
+          <w:sz w:val="24"/>
+          <w:szCs w:val="24"/>
+        </w:rPr>
+        <w:t>interpretação típica e estatisticamente coerente</w:t>
+      </w:r>
+      <w:r>
+        <w:rPr>
+          <w:sz w:val="24"/>
+          <w:szCs w:val="24"/>
+        </w:rPr>
+        <w:t xml:space="preserve"> para este </w:t>
+      </w:r>
+      <w:proofErr w:type="spellStart"/>
+      <w:r>
+        <w:rPr>
+          <w:sz w:val="24"/>
+          <w:szCs w:val="24"/>
+        </w:rPr>
+        <w:t>dataset</w:t>
+      </w:r>
+      <w:proofErr w:type="spellEnd"/>
+      <w:r>
+        <w:rPr>
+          <w:sz w:val="24"/>
+          <w:szCs w:val="24"/>
+        </w:rPr>
+        <w:t xml:space="preserve">, amplamente usada em aulas, </w:t>
+      </w:r>
+      <w:proofErr w:type="spellStart"/>
+      <w:r>
+        <w:rPr>
+          <w:sz w:val="24"/>
+          <w:szCs w:val="24"/>
+        </w:rPr>
+        <w:t>papers</w:t>
+      </w:r>
+      <w:proofErr w:type="spellEnd"/>
+      <w:r>
+        <w:rPr>
+          <w:sz w:val="24"/>
+          <w:szCs w:val="24"/>
+        </w:rPr>
+        <w:t xml:space="preserve"> e projetos equivalentes.</w:t>
+      </w:r>
+    </w:p>
+    <w:p>
+      <w:pPr>
+        <w:pStyle w:val="PargrafodaLista"/>
+        <w:ind w:left="0"/>
+        <w:jc w:val="both"/>
+        <w:rPr>
+          <w:sz w:val="24"/>
+          <w:szCs w:val="24"/>
+        </w:rPr>
+      </w:pPr>
+    </w:p>
+    <w:p>
+      <w:pPr>
+        <w:pStyle w:val="PargrafodaLista"/>
+        <w:ind w:left="0"/>
+        <w:jc w:val="both"/>
+        <w:rPr>
+          <w:sz w:val="24"/>
+          <w:szCs w:val="24"/>
+        </w:rPr>
+      </w:pPr>
+    </w:p>
+    <w:p>
+      <w:pPr>
+        <w:pStyle w:val="PargrafodaLista"/>
+        <w:ind w:left="0"/>
+        <w:jc w:val="both"/>
+        <w:rPr>
+          <w:b/>
+          <w:bCs/>
+          <w:sz w:val="24"/>
+          <w:szCs w:val="24"/>
+        </w:rPr>
+      </w:pPr>
+      <w:r>
+        <w:rPr>
+          <w:b/>
+          <w:bCs/>
+          <w:sz w:val="24"/>
+          <w:szCs w:val="24"/>
+        </w:rPr>
+        <w:t>Cluster 1 — Países de Altíssimo Desenvolvimento</w:t>
+      </w:r>
+    </w:p>
+    <w:p>
+      <w:pPr>
+        <w:pStyle w:val="PargrafodaLista"/>
+        <w:ind w:left="0"/>
+        <w:jc w:val="both"/>
+        <w:rPr>
+          <w:sz w:val="24"/>
+          <w:szCs w:val="24"/>
+        </w:rPr>
+      </w:pPr>
+      <w:r>
+        <w:rPr>
+          <w:b/>
+          <w:bCs/>
+          <w:sz w:val="24"/>
+          <w:szCs w:val="24"/>
+        </w:rPr>
+        <w:t>Perfil geral:</w:t>
+      </w:r>
+    </w:p>
+    <w:p>
+      <w:pPr>
+        <w:pStyle w:val="PargrafodaLista"/>
+        <w:numPr>
+          <w:ilvl w:val="0"/>
+          <w:numId w:val="65"/>
+        </w:numPr>
+        <w:jc w:val="both"/>
+        <w:rPr>
+          <w:sz w:val="24"/>
+          <w:szCs w:val="24"/>
+        </w:rPr>
+      </w:pPr>
+      <w:r>
+        <w:rPr>
+          <w:b/>
+          <w:bCs/>
+          <w:sz w:val="24"/>
+          <w:szCs w:val="24"/>
+        </w:rPr>
+        <w:t>Alto income</w:t>
+      </w:r>
+      <w:r>
+        <w:rPr>
+          <w:sz w:val="24"/>
+          <w:szCs w:val="24"/>
+        </w:rPr>
+        <w:t xml:space="preserve"> (renda per capita muito alta)</w:t>
+      </w:r>
+    </w:p>
+    <w:p>
+      <w:pPr>
+        <w:pStyle w:val="PargrafodaLista"/>
+        <w:numPr>
+          <w:ilvl w:val="0"/>
+          <w:numId w:val="65"/>
+        </w:numPr>
+        <w:jc w:val="both"/>
+        <w:rPr>
+          <w:sz w:val="24"/>
+          <w:szCs w:val="24"/>
+        </w:rPr>
+      </w:pPr>
+      <w:r>
+        <w:rPr>
+          <w:b/>
+          <w:bCs/>
+          <w:sz w:val="24"/>
+          <w:szCs w:val="24"/>
+        </w:rPr>
+        <w:t xml:space="preserve">Alto </w:t>
+      </w:r>
+      <w:proofErr w:type="spellStart"/>
+      <w:r>
+        <w:rPr>
+          <w:b/>
+          <w:bCs/>
+          <w:sz w:val="24"/>
+          <w:szCs w:val="24"/>
+        </w:rPr>
+        <w:t>gdpp</w:t>
+      </w:r>
+      <w:proofErr w:type="spellEnd"/>
+      <w:r>
+        <w:rPr>
+          <w:sz w:val="24"/>
+          <w:szCs w:val="24"/>
+        </w:rPr>
+        <w:t xml:space="preserve"> (PIB per capita)</w:t>
+      </w:r>
+    </w:p>
+    <w:p>
+      <w:pPr>
+        <w:pStyle w:val="PargrafodaLista"/>
+        <w:numPr>
+          <w:ilvl w:val="0"/>
+          <w:numId w:val="65"/>
+        </w:numPr>
+        <w:jc w:val="both"/>
+        <w:rPr>
+          <w:sz w:val="24"/>
+          <w:szCs w:val="24"/>
+        </w:rPr>
+      </w:pPr>
+      <w:r>
+        <w:rPr>
+          <w:b/>
+          <w:bCs/>
+          <w:sz w:val="24"/>
+          <w:szCs w:val="24"/>
+        </w:rPr>
+        <w:t xml:space="preserve">Alta </w:t>
+      </w:r>
+      <w:proofErr w:type="spellStart"/>
+      <w:r>
+        <w:rPr>
+          <w:b/>
+          <w:bCs/>
+          <w:sz w:val="24"/>
+          <w:szCs w:val="24"/>
+        </w:rPr>
+        <w:t>life_expec</w:t>
+      </w:r>
+      <w:proofErr w:type="spellEnd"/>
+      <w:r>
+        <w:rPr>
+          <w:sz w:val="24"/>
+          <w:szCs w:val="24"/>
+        </w:rPr>
+        <w:t xml:space="preserve"> (expectativa de vida)</w:t>
+      </w:r>
+    </w:p>
+    <w:p>
+      <w:pPr>
+        <w:pStyle w:val="PargrafodaLista"/>
+        <w:numPr>
+          <w:ilvl w:val="0"/>
+          <w:numId w:val="65"/>
+        </w:numPr>
+        <w:jc w:val="both"/>
+        <w:rPr>
+          <w:sz w:val="24"/>
+          <w:szCs w:val="24"/>
+        </w:rPr>
+      </w:pPr>
+      <w:r>
+        <w:rPr>
+          <w:b/>
+          <w:bCs/>
+          <w:sz w:val="24"/>
+          <w:szCs w:val="24"/>
+        </w:rPr>
+        <w:t xml:space="preserve">Baixa </w:t>
+      </w:r>
+      <w:proofErr w:type="spellStart"/>
+      <w:r>
+        <w:rPr>
+          <w:b/>
+          <w:bCs/>
+          <w:sz w:val="24"/>
+          <w:szCs w:val="24"/>
+        </w:rPr>
+        <w:t>child_mort</w:t>
+      </w:r>
+      <w:proofErr w:type="spellEnd"/>
+    </w:p>
+    <w:p>
+      <w:pPr>
+        <w:pStyle w:val="PargrafodaLista"/>
+        <w:numPr>
+          <w:ilvl w:val="0"/>
+          <w:numId w:val="65"/>
+        </w:numPr>
+        <w:jc w:val="both"/>
+        <w:rPr>
+          <w:sz w:val="24"/>
+          <w:szCs w:val="24"/>
+        </w:rPr>
+      </w:pPr>
+      <w:r>
+        <w:rPr>
+          <w:b/>
+          <w:bCs/>
+          <w:sz w:val="24"/>
+          <w:szCs w:val="24"/>
+        </w:rPr>
+        <w:t xml:space="preserve">Baixa </w:t>
+      </w:r>
+      <w:proofErr w:type="spellStart"/>
+      <w:r>
+        <w:rPr>
+          <w:b/>
+          <w:bCs/>
+          <w:sz w:val="24"/>
+          <w:szCs w:val="24"/>
+        </w:rPr>
+        <w:t>total_fer</w:t>
+      </w:r>
+      <w:proofErr w:type="spellEnd"/>
+    </w:p>
+    <w:p>
+      <w:pPr>
+        <w:pStyle w:val="PargrafodaLista"/>
+        <w:numPr>
+          <w:ilvl w:val="0"/>
+          <w:numId w:val="65"/>
+        </w:numPr>
+        <w:jc w:val="both"/>
+        <w:rPr>
+          <w:sz w:val="24"/>
+          <w:szCs w:val="24"/>
+        </w:rPr>
+      </w:pPr>
+      <w:r>
+        <w:rPr>
+          <w:sz w:val="24"/>
+          <w:szCs w:val="24"/>
+        </w:rPr>
+        <w:t>Exportações e importações equilibradas</w:t>
+      </w:r>
+    </w:p>
+    <w:p>
+      <w:pPr>
+        <w:pStyle w:val="PargrafodaLista"/>
+        <w:numPr>
+          <w:ilvl w:val="0"/>
+          <w:numId w:val="65"/>
+        </w:numPr>
+        <w:jc w:val="both"/>
+        <w:rPr>
+          <w:sz w:val="24"/>
+          <w:szCs w:val="24"/>
+        </w:rPr>
+      </w:pPr>
+      <w:r>
+        <w:rPr>
+          <w:sz w:val="24"/>
+          <w:szCs w:val="24"/>
+        </w:rPr>
+        <w:t>Inflação baixa</w:t>
+      </w:r>
+    </w:p>
+    <w:p>
+      <w:pPr>
+        <w:pStyle w:val="PargrafodaLista"/>
+        <w:jc w:val="both"/>
+        <w:rPr>
+          <w:sz w:val="24"/>
+          <w:szCs w:val="24"/>
+        </w:rPr>
+      </w:pPr>
+    </w:p>
+    <w:p>
+      <w:pPr>
+        <w:pStyle w:val="PargrafodaLista"/>
+        <w:ind w:left="0"/>
+        <w:jc w:val="both"/>
+        <w:rPr>
+          <w:sz w:val="24"/>
+          <w:szCs w:val="24"/>
+        </w:rPr>
+      </w:pPr>
+      <w:r>
+        <w:rPr>
+          <w:b/>
+          <w:bCs/>
+          <w:sz w:val="24"/>
+          <w:szCs w:val="24"/>
+        </w:rPr>
+        <w:t>Interpretação:</w:t>
+      </w:r>
+      <w:r>
+        <w:rPr>
+          <w:sz w:val="24"/>
+          <w:szCs w:val="24"/>
+        </w:rPr>
+        <w:br/>
+        <w:t xml:space="preserve">Este grupo representa </w:t>
+      </w:r>
+      <w:r>
+        <w:rPr>
+          <w:b/>
+          <w:bCs/>
+          <w:sz w:val="24"/>
+          <w:szCs w:val="24"/>
+        </w:rPr>
+        <w:t>países desenvolvidos</w:t>
+      </w:r>
+      <w:r>
+        <w:rPr>
+          <w:sz w:val="24"/>
+          <w:szCs w:val="24"/>
+        </w:rPr>
+        <w:t>, economias avançadas, alto investimento em saúde e educação, baixa mortalidade infantil e elevada qualidade de vida.</w:t>
+      </w:r>
+    </w:p>
+    <w:p>
+      <w:pPr>
+        <w:pStyle w:val="PargrafodaLista"/>
+        <w:ind w:left="0"/>
+        <w:jc w:val="both"/>
+        <w:rPr>
+          <w:sz w:val="24"/>
+          <w:szCs w:val="24"/>
+        </w:rPr>
+      </w:pPr>
+      <w:r>
+        <w:rPr>
+          <w:b/>
+          <w:bCs/>
+          <w:sz w:val="24"/>
+          <w:szCs w:val="24"/>
+        </w:rPr>
+        <w:t>Exemplos</w:t>
+      </w:r>
+      <w:r>
+        <w:rPr>
+          <w:b/>
+          <w:bCs/>
+          <w:sz w:val="24"/>
+          <w:szCs w:val="24"/>
+        </w:rPr>
+        <w:t xml:space="preserve"> </w:t>
+      </w:r>
+      <w:r>
+        <w:rPr>
+          <w:b/>
+          <w:bCs/>
+          <w:sz w:val="24"/>
+          <w:szCs w:val="24"/>
+        </w:rPr>
+        <w:t>típicos</w:t>
+      </w:r>
+      <w:r>
+        <w:rPr>
+          <w:sz w:val="24"/>
+          <w:szCs w:val="24"/>
+        </w:rPr>
+        <w:t xml:space="preserve"> </w:t>
+      </w:r>
+      <w:r>
+        <w:rPr>
+          <w:rFonts w:ascii="Segoe UI Emoji" w:hAnsi="Segoe UI Emoji" w:cs="Segoe UI Emoji"/>
+          <w:sz w:val="24"/>
+          <w:szCs w:val="24"/>
+        </w:rPr>
+        <w:t>🇺🇸</w:t>
+      </w:r>
+      <w:r>
+        <w:rPr>
+          <w:sz w:val="24"/>
+          <w:szCs w:val="24"/>
+        </w:rPr>
+        <w:t xml:space="preserve"> EUA, </w:t>
+      </w:r>
+      <w:r>
+        <w:rPr>
+          <w:rFonts w:ascii="Segoe UI Emoji" w:hAnsi="Segoe UI Emoji" w:cs="Segoe UI Emoji"/>
+          <w:sz w:val="24"/>
+          <w:szCs w:val="24"/>
+        </w:rPr>
+        <w:t>🇯🇵</w:t>
+      </w:r>
+      <w:r>
+        <w:rPr>
+          <w:sz w:val="24"/>
+          <w:szCs w:val="24"/>
+        </w:rPr>
+        <w:t xml:space="preserve"> Japão, </w:t>
+      </w:r>
+      <w:r>
+        <w:rPr>
+          <w:rFonts w:ascii="Segoe UI Emoji" w:hAnsi="Segoe UI Emoji" w:cs="Segoe UI Emoji"/>
+          <w:sz w:val="24"/>
+          <w:szCs w:val="24"/>
+        </w:rPr>
+        <w:t>🇩🇪</w:t>
+      </w:r>
+      <w:r>
+        <w:rPr>
+          <w:sz w:val="24"/>
+          <w:szCs w:val="24"/>
+        </w:rPr>
+        <w:t xml:space="preserve"> Alemanha, </w:t>
+      </w:r>
+      <w:r>
+        <w:rPr>
+          <w:rFonts w:ascii="Segoe UI Emoji" w:hAnsi="Segoe UI Emoji" w:cs="Segoe UI Emoji"/>
+          <w:sz w:val="24"/>
+          <w:szCs w:val="24"/>
+        </w:rPr>
+        <w:t>🇫🇷</w:t>
+      </w:r>
+      <w:r>
+        <w:rPr>
+          <w:sz w:val="24"/>
+          <w:szCs w:val="24"/>
+        </w:rPr>
+        <w:t xml:space="preserve"> França.</w:t>
+      </w:r>
+    </w:p>
+    <w:p>
+      <w:pPr>
+        <w:pStyle w:val="PargrafodaLista"/>
+        <w:ind w:left="0"/>
+        <w:jc w:val="both"/>
+        <w:rPr>
+          <w:sz w:val="24"/>
+          <w:szCs w:val="24"/>
+        </w:rPr>
+      </w:pPr>
+    </w:p>
+    <w:p>
+      <w:pPr>
+        <w:pStyle w:val="PargrafodaLista"/>
+        <w:ind w:left="0"/>
+        <w:jc w:val="both"/>
+        <w:rPr>
+          <w:sz w:val="24"/>
+          <w:szCs w:val="24"/>
+        </w:rPr>
+      </w:pPr>
+    </w:p>
+    <w:p>
+      <w:pPr>
+        <w:pStyle w:val="PargrafodaLista"/>
+        <w:ind w:left="0"/>
+        <w:jc w:val="both"/>
+        <w:rPr>
+          <w:sz w:val="24"/>
+          <w:szCs w:val="24"/>
+        </w:rPr>
+      </w:pPr>
+    </w:p>
+    <w:p>
+      <w:pPr>
+        <w:pStyle w:val="PargrafodaLista"/>
+        <w:ind w:left="0"/>
+        <w:jc w:val="both"/>
+        <w:rPr>
+          <w:b/>
+          <w:bCs/>
+          <w:sz w:val="24"/>
+          <w:szCs w:val="24"/>
+        </w:rPr>
+      </w:pPr>
+      <w:r>
+        <w:rPr>
+          <w:b/>
+          <w:bCs/>
+          <w:sz w:val="24"/>
+          <w:szCs w:val="24"/>
+        </w:rPr>
+        <w:t>Cluster 2 — Economias Emergentes de Médio/Alto Desenvolvimento</w:t>
+      </w:r>
+    </w:p>
+    <w:p>
+      <w:pPr>
+        <w:pStyle w:val="PargrafodaLista"/>
+        <w:ind w:left="0"/>
+        <w:jc w:val="both"/>
+        <w:rPr>
+          <w:sz w:val="24"/>
+          <w:szCs w:val="24"/>
+        </w:rPr>
+      </w:pPr>
+      <w:r>
+        <w:rPr>
+          <w:b/>
+          <w:bCs/>
+          <w:sz w:val="24"/>
+          <w:szCs w:val="24"/>
+        </w:rPr>
+        <w:t>Perfil geral:</w:t>
+      </w:r>
+    </w:p>
+    <w:p>
+      <w:pPr>
+        <w:pStyle w:val="PargrafodaLista"/>
+        <w:numPr>
+          <w:ilvl w:val="0"/>
+          <w:numId w:val="66"/>
+        </w:numPr>
+        <w:jc w:val="both"/>
+        <w:rPr>
+          <w:sz w:val="24"/>
+          <w:szCs w:val="24"/>
+        </w:rPr>
+      </w:pPr>
+      <w:r>
+        <w:rPr>
+          <w:sz w:val="24"/>
+          <w:szCs w:val="24"/>
+        </w:rPr>
+        <w:t xml:space="preserve">Income e </w:t>
+      </w:r>
+      <w:proofErr w:type="spellStart"/>
+      <w:r>
+        <w:rPr>
+          <w:sz w:val="24"/>
+          <w:szCs w:val="24"/>
+        </w:rPr>
+        <w:t>gdpp</w:t>
+      </w:r>
+      <w:proofErr w:type="spellEnd"/>
+      <w:r>
+        <w:rPr>
+          <w:sz w:val="24"/>
+          <w:szCs w:val="24"/>
+        </w:rPr>
+        <w:t xml:space="preserve"> </w:t>
+      </w:r>
+      <w:r>
+        <w:rPr>
+          <w:b/>
+          <w:bCs/>
+          <w:sz w:val="24"/>
+          <w:szCs w:val="24"/>
+        </w:rPr>
+        <w:t>médios</w:t>
+      </w:r>
+    </w:p>
+    <w:p>
+      <w:pPr>
+        <w:pStyle w:val="PargrafodaLista"/>
+        <w:numPr>
+          <w:ilvl w:val="0"/>
+          <w:numId w:val="66"/>
+        </w:numPr>
+        <w:jc w:val="both"/>
+        <w:rPr>
+          <w:sz w:val="24"/>
+          <w:szCs w:val="24"/>
+        </w:rPr>
+      </w:pPr>
+      <w:proofErr w:type="spellStart"/>
+      <w:r>
+        <w:rPr>
+          <w:sz w:val="24"/>
+          <w:szCs w:val="24"/>
+        </w:rPr>
+        <w:t>Life_expec</w:t>
+      </w:r>
+      <w:proofErr w:type="spellEnd"/>
+      <w:r>
+        <w:rPr>
+          <w:sz w:val="24"/>
+          <w:szCs w:val="24"/>
+        </w:rPr>
+        <w:t xml:space="preserve"> razoável</w:t>
+      </w:r>
+    </w:p>
+    <w:p>
+      <w:pPr>
+        <w:pStyle w:val="PargrafodaLista"/>
+        <w:numPr>
+          <w:ilvl w:val="0"/>
+          <w:numId w:val="66"/>
+        </w:numPr>
+        <w:jc w:val="both"/>
+        <w:rPr>
+          <w:sz w:val="24"/>
+          <w:szCs w:val="24"/>
+        </w:rPr>
+      </w:pPr>
+      <w:proofErr w:type="spellStart"/>
+      <w:r>
+        <w:rPr>
+          <w:sz w:val="24"/>
+          <w:szCs w:val="24"/>
+        </w:rPr>
+        <w:t>Child_mort</w:t>
+      </w:r>
+      <w:proofErr w:type="spellEnd"/>
+      <w:r>
+        <w:rPr>
+          <w:sz w:val="24"/>
+          <w:szCs w:val="24"/>
+        </w:rPr>
+        <w:t xml:space="preserve"> moderada</w:t>
+      </w:r>
+    </w:p>
+    <w:p>
+      <w:pPr>
+        <w:pStyle w:val="PargrafodaLista"/>
+        <w:numPr>
+          <w:ilvl w:val="0"/>
+          <w:numId w:val="66"/>
+        </w:numPr>
+        <w:jc w:val="both"/>
+        <w:rPr>
+          <w:sz w:val="24"/>
+          <w:szCs w:val="24"/>
+        </w:rPr>
+      </w:pPr>
+      <w:proofErr w:type="spellStart"/>
+      <w:r>
+        <w:rPr>
+          <w:sz w:val="24"/>
+          <w:szCs w:val="24"/>
+        </w:rPr>
+        <w:t>Total_fer</w:t>
+      </w:r>
+      <w:proofErr w:type="spellEnd"/>
+      <w:r>
+        <w:rPr>
+          <w:sz w:val="24"/>
+          <w:szCs w:val="24"/>
+        </w:rPr>
+        <w:t xml:space="preserve"> intermediária</w:t>
+      </w:r>
+    </w:p>
+    <w:p>
+      <w:pPr>
+        <w:pStyle w:val="PargrafodaLista"/>
+        <w:numPr>
+          <w:ilvl w:val="0"/>
+          <w:numId w:val="66"/>
+        </w:numPr>
+        <w:jc w:val="both"/>
+        <w:rPr>
+          <w:sz w:val="24"/>
+          <w:szCs w:val="24"/>
+        </w:rPr>
+      </w:pPr>
+      <w:proofErr w:type="spellStart"/>
+      <w:r>
+        <w:rPr>
+          <w:sz w:val="24"/>
+          <w:szCs w:val="24"/>
+        </w:rPr>
+        <w:t>Export</w:t>
+      </w:r>
+      <w:proofErr w:type="spellEnd"/>
+      <w:r>
+        <w:rPr>
+          <w:sz w:val="24"/>
+          <w:szCs w:val="24"/>
+        </w:rPr>
+        <w:t>/</w:t>
+      </w:r>
+      <w:proofErr w:type="spellStart"/>
+      <w:r>
+        <w:rPr>
+          <w:sz w:val="24"/>
+          <w:szCs w:val="24"/>
+        </w:rPr>
+        <w:t>import</w:t>
+      </w:r>
+      <w:proofErr w:type="spellEnd"/>
+      <w:r>
+        <w:rPr>
+          <w:sz w:val="24"/>
+          <w:szCs w:val="24"/>
+        </w:rPr>
+        <w:t xml:space="preserve"> moderados</w:t>
+      </w:r>
+    </w:p>
+    <w:p>
+      <w:pPr>
+        <w:pStyle w:val="PargrafodaLista"/>
+        <w:jc w:val="both"/>
+        <w:rPr>
+          <w:sz w:val="24"/>
+          <w:szCs w:val="24"/>
+        </w:rPr>
+      </w:pPr>
+    </w:p>
+    <w:p>
+      <w:pPr>
+        <w:pStyle w:val="PargrafodaLista"/>
+        <w:ind w:left="0"/>
+        <w:jc w:val="both"/>
+        <w:rPr>
+          <w:sz w:val="24"/>
+          <w:szCs w:val="24"/>
+        </w:rPr>
+      </w:pPr>
+      <w:r>
+        <w:rPr>
+          <w:b/>
+          <w:bCs/>
+          <w:sz w:val="24"/>
+          <w:szCs w:val="24"/>
+        </w:rPr>
+        <w:t>Interpretação:</w:t>
+      </w:r>
+      <w:r>
+        <w:rPr>
+          <w:sz w:val="24"/>
+          <w:szCs w:val="24"/>
+        </w:rPr>
+        <w:br/>
+        <w:t>Países que avançaram bastante em desenvolvimento, mas ainda enfrentam desigualdades internas e desafios estruturais.</w:t>
+      </w:r>
+      <w:r>
+        <w:rPr>
+          <w:sz w:val="24"/>
+          <w:szCs w:val="24"/>
+        </w:rPr>
+        <w:t xml:space="preserve"> </w:t>
+      </w:r>
+      <w:r>
+        <w:rPr>
+          <w:sz w:val="24"/>
+          <w:szCs w:val="24"/>
+        </w:rPr>
+        <w:t>Têm economia crescente, indicadores de saúde razoáveis, mas não atingem padrões altamente desenvolvidos.</w:t>
+      </w:r>
+    </w:p>
+    <w:p>
+      <w:pPr>
+        <w:pStyle w:val="PargrafodaLista"/>
+        <w:ind w:left="0"/>
+        <w:jc w:val="both"/>
+        <w:rPr>
+          <w:sz w:val="24"/>
+          <w:szCs w:val="24"/>
+        </w:rPr>
+      </w:pPr>
+      <w:r>
+        <w:rPr>
+          <w:b/>
+          <w:bCs/>
+          <w:sz w:val="24"/>
+          <w:szCs w:val="24"/>
+        </w:rPr>
+        <w:t>Exemplos típicos:</w:t>
+      </w:r>
+      <w:r>
+        <w:rPr>
+          <w:sz w:val="24"/>
+          <w:szCs w:val="24"/>
+        </w:rPr>
+        <w:t xml:space="preserve"> </w:t>
+      </w:r>
+      <w:r>
+        <w:rPr>
+          <w:rFonts w:ascii="Segoe UI Emoji" w:hAnsi="Segoe UI Emoji" w:cs="Segoe UI Emoji"/>
+          <w:sz w:val="24"/>
+          <w:szCs w:val="24"/>
+        </w:rPr>
+        <w:t>🇧🇷</w:t>
+      </w:r>
+      <w:r>
+        <w:rPr>
+          <w:sz w:val="24"/>
+          <w:szCs w:val="24"/>
+        </w:rPr>
+        <w:t xml:space="preserve"> Brasil, </w:t>
+      </w:r>
+      <w:r>
+        <w:rPr>
+          <w:rFonts w:ascii="Segoe UI Emoji" w:hAnsi="Segoe UI Emoji" w:cs="Segoe UI Emoji"/>
+          <w:sz w:val="24"/>
+          <w:szCs w:val="24"/>
+        </w:rPr>
+        <w:t>🇲🇽</w:t>
+      </w:r>
+      <w:r>
+        <w:rPr>
+          <w:sz w:val="24"/>
+          <w:szCs w:val="24"/>
+        </w:rPr>
+        <w:t xml:space="preserve"> México, </w:t>
+      </w:r>
+      <w:r>
+        <w:rPr>
+          <w:rFonts w:ascii="Segoe UI Emoji" w:hAnsi="Segoe UI Emoji" w:cs="Segoe UI Emoji"/>
+          <w:sz w:val="24"/>
+          <w:szCs w:val="24"/>
+        </w:rPr>
+        <w:t>🇹🇷</w:t>
+      </w:r>
+      <w:r>
+        <w:rPr>
+          <w:sz w:val="24"/>
+          <w:szCs w:val="24"/>
+        </w:rPr>
+        <w:t xml:space="preserve"> Turquia.</w:t>
+      </w:r>
+    </w:p>
+    <w:p>
+      <w:pPr>
+        <w:pStyle w:val="PargrafodaLista"/>
+        <w:ind w:left="0"/>
+        <w:jc w:val="both"/>
+        <w:rPr>
+          <w:sz w:val="24"/>
+          <w:szCs w:val="24"/>
+          <w:u w:val="single"/>
+        </w:rPr>
+      </w:pPr>
+    </w:p>
+    <w:p>
+      <w:pPr>
+        <w:pStyle w:val="PargrafodaLista"/>
+        <w:ind w:left="0"/>
+        <w:jc w:val="both"/>
+        <w:rPr>
+          <w:sz w:val="24"/>
+          <w:szCs w:val="24"/>
+        </w:rPr>
+      </w:pPr>
+    </w:p>
+    <w:p>
+      <w:pPr>
+        <w:pStyle w:val="PargrafodaLista"/>
+        <w:ind w:left="0"/>
+        <w:jc w:val="both"/>
+        <w:rPr>
+          <w:sz w:val="24"/>
+          <w:szCs w:val="24"/>
+        </w:rPr>
+      </w:pPr>
+    </w:p>
+    <w:p>
+      <w:pPr>
+        <w:pStyle w:val="PargrafodaLista"/>
+        <w:ind w:left="0"/>
+        <w:jc w:val="both"/>
+        <w:rPr>
+          <w:sz w:val="24"/>
+          <w:szCs w:val="24"/>
+        </w:rPr>
+      </w:pPr>
+    </w:p>
+    <w:p>
+      <w:pPr>
+        <w:pStyle w:val="PargrafodaLista"/>
+        <w:ind w:left="0"/>
+        <w:jc w:val="both"/>
+        <w:rPr>
+          <w:sz w:val="24"/>
+          <w:szCs w:val="24"/>
+        </w:rPr>
+      </w:pPr>
+    </w:p>
+    <w:p>
+      <w:pPr>
+        <w:pStyle w:val="PargrafodaLista"/>
+        <w:ind w:left="0"/>
+        <w:jc w:val="both"/>
+        <w:rPr>
+          <w:sz w:val="24"/>
+          <w:szCs w:val="24"/>
+        </w:rPr>
+      </w:pPr>
+    </w:p>
+    <w:p>
+      <w:pPr>
+        <w:pStyle w:val="PargrafodaLista"/>
+        <w:ind w:left="0"/>
+        <w:jc w:val="both"/>
+        <w:rPr>
+          <w:sz w:val="24"/>
+          <w:szCs w:val="24"/>
+        </w:rPr>
+      </w:pPr>
+    </w:p>
+    <w:p>
+      <w:pPr>
+        <w:pStyle w:val="PargrafodaLista"/>
+        <w:ind w:left="0"/>
+        <w:jc w:val="both"/>
+        <w:rPr>
+          <w:b/>
+          <w:bCs/>
+          <w:sz w:val="24"/>
+          <w:szCs w:val="24"/>
+        </w:rPr>
+      </w:pPr>
+      <w:r>
+        <w:rPr>
+          <w:b/>
+          <w:bCs/>
+          <w:sz w:val="24"/>
+          <w:szCs w:val="24"/>
+        </w:rPr>
+        <w:lastRenderedPageBreak/>
+        <w:t>Cluster 3 — Países em Desenvolvimento com Desafios Sociais Significativos</w:t>
+      </w:r>
+    </w:p>
+    <w:p>
+      <w:pPr>
+        <w:pStyle w:val="PargrafodaLista"/>
+        <w:ind w:left="0"/>
+        <w:jc w:val="both"/>
+        <w:rPr>
+          <w:sz w:val="24"/>
+          <w:szCs w:val="24"/>
+        </w:rPr>
+      </w:pPr>
+      <w:r>
+        <w:rPr>
+          <w:b/>
+          <w:bCs/>
+          <w:sz w:val="24"/>
+          <w:szCs w:val="24"/>
+        </w:rPr>
+        <w:t>Perfil geral:</w:t>
+      </w:r>
+    </w:p>
+    <w:p>
+      <w:pPr>
+        <w:pStyle w:val="PargrafodaLista"/>
+        <w:numPr>
+          <w:ilvl w:val="0"/>
+          <w:numId w:val="67"/>
+        </w:numPr>
+        <w:jc w:val="both"/>
+        <w:rPr>
+          <w:sz w:val="24"/>
+          <w:szCs w:val="24"/>
+        </w:rPr>
+      </w:pPr>
+      <w:proofErr w:type="spellStart"/>
+      <w:r>
+        <w:rPr>
+          <w:sz w:val="24"/>
+          <w:szCs w:val="24"/>
+        </w:rPr>
+        <w:t>Low</w:t>
+      </w:r>
+      <w:proofErr w:type="spellEnd"/>
+      <w:r>
+        <w:rPr>
+          <w:sz w:val="24"/>
+          <w:szCs w:val="24"/>
+        </w:rPr>
+        <w:t xml:space="preserve"> income e </w:t>
+      </w:r>
+      <w:proofErr w:type="spellStart"/>
+      <w:r>
+        <w:rPr>
+          <w:sz w:val="24"/>
+          <w:szCs w:val="24"/>
+        </w:rPr>
+        <w:t>low</w:t>
+      </w:r>
+      <w:proofErr w:type="spellEnd"/>
+      <w:r>
+        <w:rPr>
+          <w:sz w:val="24"/>
+          <w:szCs w:val="24"/>
+        </w:rPr>
+        <w:t xml:space="preserve"> </w:t>
+      </w:r>
+      <w:proofErr w:type="spellStart"/>
+      <w:r>
+        <w:rPr>
+          <w:sz w:val="24"/>
+          <w:szCs w:val="24"/>
+        </w:rPr>
+        <w:t>gdpp</w:t>
+      </w:r>
+      <w:proofErr w:type="spellEnd"/>
+    </w:p>
+    <w:p>
+      <w:pPr>
+        <w:pStyle w:val="PargrafodaLista"/>
+        <w:numPr>
+          <w:ilvl w:val="0"/>
+          <w:numId w:val="67"/>
+        </w:numPr>
+        <w:jc w:val="both"/>
+        <w:rPr>
+          <w:sz w:val="24"/>
+          <w:szCs w:val="24"/>
+        </w:rPr>
+      </w:pPr>
+      <w:proofErr w:type="spellStart"/>
+      <w:r>
+        <w:rPr>
+          <w:sz w:val="24"/>
+          <w:szCs w:val="24"/>
+        </w:rPr>
+        <w:t>Life_expec</w:t>
+      </w:r>
+      <w:proofErr w:type="spellEnd"/>
+      <w:r>
+        <w:rPr>
+          <w:sz w:val="24"/>
+          <w:szCs w:val="24"/>
+        </w:rPr>
+        <w:t xml:space="preserve"> baixa</w:t>
+      </w:r>
+    </w:p>
+    <w:p>
+      <w:pPr>
+        <w:pStyle w:val="PargrafodaLista"/>
+        <w:numPr>
+          <w:ilvl w:val="0"/>
+          <w:numId w:val="67"/>
+        </w:numPr>
+        <w:jc w:val="both"/>
+        <w:rPr>
+          <w:sz w:val="24"/>
+          <w:szCs w:val="24"/>
+        </w:rPr>
+      </w:pPr>
+      <w:proofErr w:type="spellStart"/>
+      <w:r>
+        <w:rPr>
+          <w:sz w:val="24"/>
+          <w:szCs w:val="24"/>
+        </w:rPr>
+        <w:t>Child_mort</w:t>
+      </w:r>
+      <w:proofErr w:type="spellEnd"/>
+      <w:r>
+        <w:rPr>
+          <w:sz w:val="24"/>
+          <w:szCs w:val="24"/>
+        </w:rPr>
+        <w:t xml:space="preserve"> elevada</w:t>
+      </w:r>
+    </w:p>
+    <w:p>
+      <w:pPr>
+        <w:pStyle w:val="PargrafodaLista"/>
+        <w:numPr>
+          <w:ilvl w:val="0"/>
+          <w:numId w:val="67"/>
+        </w:numPr>
+        <w:jc w:val="both"/>
+        <w:rPr>
+          <w:sz w:val="24"/>
+          <w:szCs w:val="24"/>
+        </w:rPr>
+      </w:pPr>
+      <w:r>
+        <w:rPr>
+          <w:sz w:val="24"/>
+          <w:szCs w:val="24"/>
+        </w:rPr>
+        <w:t>Fertilidade alta</w:t>
+      </w:r>
+    </w:p>
+    <w:p>
+      <w:pPr>
+        <w:pStyle w:val="PargrafodaLista"/>
+        <w:numPr>
+          <w:ilvl w:val="0"/>
+          <w:numId w:val="67"/>
+        </w:numPr>
+        <w:jc w:val="both"/>
+        <w:rPr>
+          <w:sz w:val="24"/>
+          <w:szCs w:val="24"/>
+        </w:rPr>
+      </w:pPr>
+      <w:proofErr w:type="spellStart"/>
+      <w:r>
+        <w:rPr>
+          <w:sz w:val="24"/>
+          <w:szCs w:val="24"/>
+        </w:rPr>
+        <w:t>Export</w:t>
+      </w:r>
+      <w:proofErr w:type="spellEnd"/>
+      <w:r>
+        <w:rPr>
+          <w:sz w:val="24"/>
+          <w:szCs w:val="24"/>
+        </w:rPr>
+        <w:t>/</w:t>
+      </w:r>
+      <w:proofErr w:type="spellStart"/>
+      <w:r>
+        <w:rPr>
+          <w:sz w:val="24"/>
+          <w:szCs w:val="24"/>
+        </w:rPr>
+        <w:t>import</w:t>
+      </w:r>
+      <w:proofErr w:type="spellEnd"/>
+      <w:r>
+        <w:rPr>
+          <w:sz w:val="24"/>
+          <w:szCs w:val="24"/>
+        </w:rPr>
+        <w:t xml:space="preserve"> baixos ou desequilibrados</w:t>
+      </w:r>
+    </w:p>
+    <w:p>
+      <w:pPr>
+        <w:pStyle w:val="PargrafodaLista"/>
+        <w:ind w:left="0"/>
+        <w:jc w:val="both"/>
+        <w:rPr>
+          <w:sz w:val="24"/>
+          <w:szCs w:val="24"/>
+        </w:rPr>
+      </w:pPr>
+      <w:r>
+        <w:rPr>
+          <w:b/>
+          <w:bCs/>
+          <w:sz w:val="24"/>
+          <w:szCs w:val="24"/>
+        </w:rPr>
+        <w:t>Interpretação:</w:t>
+      </w:r>
+      <w:r>
+        <w:rPr>
+          <w:sz w:val="24"/>
+          <w:szCs w:val="24"/>
+        </w:rPr>
+        <w:br/>
+        <w:t xml:space="preserve">Países de </w:t>
+      </w:r>
+      <w:r>
+        <w:rPr>
+          <w:b/>
+          <w:bCs/>
+          <w:sz w:val="24"/>
+          <w:szCs w:val="24"/>
+        </w:rPr>
+        <w:t>baixo/médio desenvolvimento</w:t>
+      </w:r>
+      <w:r>
+        <w:rPr>
+          <w:sz w:val="24"/>
+          <w:szCs w:val="24"/>
+        </w:rPr>
+        <w:t>, ainda em transição.</w:t>
+      </w:r>
+      <w:r>
+        <w:rPr>
+          <w:sz w:val="24"/>
+          <w:szCs w:val="24"/>
+        </w:rPr>
+        <w:t xml:space="preserve"> </w:t>
+      </w:r>
+      <w:r>
+        <w:rPr>
+          <w:sz w:val="24"/>
+          <w:szCs w:val="24"/>
+        </w:rPr>
+        <w:t>Problemas sociais e de infraestrutura são visíveis, mortalidade infantil ainda elevada e renda per capita baixa.</w:t>
+      </w:r>
+    </w:p>
+    <w:p>
+      <w:pPr>
+        <w:pStyle w:val="PargrafodaLista"/>
+        <w:ind w:left="0"/>
+        <w:jc w:val="both"/>
+        <w:rPr>
+          <w:sz w:val="24"/>
+          <w:szCs w:val="24"/>
+        </w:rPr>
+      </w:pPr>
+      <w:r>
+        <w:rPr>
+          <w:b/>
+          <w:bCs/>
+          <w:sz w:val="24"/>
+          <w:szCs w:val="24"/>
+        </w:rPr>
+        <w:t>Exemplos típicos:</w:t>
+      </w:r>
+      <w:r>
+        <w:rPr>
+          <w:sz w:val="24"/>
+          <w:szCs w:val="24"/>
+        </w:rPr>
+        <w:t xml:space="preserve"> </w:t>
+      </w:r>
+      <w:r>
+        <w:rPr>
+          <w:rFonts w:ascii="Segoe UI Emoji" w:hAnsi="Segoe UI Emoji" w:cs="Segoe UI Emoji"/>
+          <w:sz w:val="24"/>
+          <w:szCs w:val="24"/>
+        </w:rPr>
+        <w:t>🇭🇳</w:t>
+      </w:r>
+      <w:r>
+        <w:rPr>
+          <w:sz w:val="24"/>
+          <w:szCs w:val="24"/>
+        </w:rPr>
+        <w:t xml:space="preserve"> Honduras, </w:t>
+      </w:r>
+      <w:r>
+        <w:rPr>
+          <w:rFonts w:ascii="Segoe UI Emoji" w:hAnsi="Segoe UI Emoji" w:cs="Segoe UI Emoji"/>
+          <w:sz w:val="24"/>
+          <w:szCs w:val="24"/>
+        </w:rPr>
+        <w:t>🇵🇭</w:t>
+      </w:r>
+      <w:r>
+        <w:rPr>
+          <w:sz w:val="24"/>
+          <w:szCs w:val="24"/>
+        </w:rPr>
+        <w:t xml:space="preserve"> Filipinas, </w:t>
+      </w:r>
+      <w:r>
+        <w:rPr>
+          <w:rFonts w:ascii="Segoe UI Emoji" w:hAnsi="Segoe UI Emoji" w:cs="Segoe UI Emoji"/>
+          <w:sz w:val="24"/>
+          <w:szCs w:val="24"/>
+        </w:rPr>
+        <w:t>🇪🇬</w:t>
+      </w:r>
+      <w:r>
+        <w:rPr>
+          <w:sz w:val="24"/>
+          <w:szCs w:val="24"/>
+        </w:rPr>
+        <w:t xml:space="preserve"> Egito.</w:t>
+      </w:r>
+    </w:p>
+    <w:p>
+      <w:pPr>
+        <w:pStyle w:val="PargrafodaLista"/>
+        <w:ind w:left="0"/>
+        <w:jc w:val="both"/>
+        <w:rPr>
+          <w:sz w:val="24"/>
+          <w:szCs w:val="24"/>
+        </w:rPr>
+      </w:pPr>
+    </w:p>
+    <w:p>
+      <w:pPr>
+        <w:pStyle w:val="PargrafodaLista"/>
+        <w:ind w:left="0"/>
+        <w:jc w:val="both"/>
+        <w:rPr>
+          <w:sz w:val="24"/>
+          <w:szCs w:val="24"/>
+        </w:rPr>
+      </w:pPr>
+    </w:p>
+    <w:p>
+      <w:pPr>
+        <w:pStyle w:val="PargrafodaLista"/>
+        <w:ind w:left="0"/>
+        <w:jc w:val="both"/>
+        <w:rPr>
+          <w:sz w:val="24"/>
+          <w:szCs w:val="24"/>
+        </w:rPr>
+      </w:pPr>
+    </w:p>
+    <w:p>
+      <w:pPr>
+        <w:pStyle w:val="PargrafodaLista"/>
+        <w:ind w:left="0"/>
+        <w:jc w:val="both"/>
+        <w:rPr>
+          <w:b/>
+          <w:bCs/>
+          <w:sz w:val="24"/>
+          <w:szCs w:val="24"/>
+        </w:rPr>
+      </w:pPr>
+      <w:r>
+        <w:rPr>
+          <w:b/>
+          <w:bCs/>
+          <w:sz w:val="24"/>
+          <w:szCs w:val="24"/>
+        </w:rPr>
+        <w:t>Cluster 4 — Países Pobres com Alta Vulnerabilidade Social</w:t>
+      </w:r>
+    </w:p>
+    <w:p>
+      <w:pPr>
+        <w:pStyle w:val="PargrafodaLista"/>
+        <w:ind w:left="0"/>
+        <w:jc w:val="both"/>
+        <w:rPr>
+          <w:sz w:val="24"/>
+          <w:szCs w:val="24"/>
+        </w:rPr>
+      </w:pPr>
+      <w:r>
+        <w:rPr>
+          <w:b/>
+          <w:bCs/>
+          <w:sz w:val="24"/>
+          <w:szCs w:val="24"/>
+        </w:rPr>
+        <w:t>Perfil geral:</w:t>
+      </w:r>
+    </w:p>
+    <w:p>
+      <w:pPr>
+        <w:pStyle w:val="PargrafodaLista"/>
+        <w:numPr>
+          <w:ilvl w:val="0"/>
+          <w:numId w:val="68"/>
+        </w:numPr>
+        <w:jc w:val="both"/>
+        <w:rPr>
+          <w:sz w:val="24"/>
+          <w:szCs w:val="24"/>
+        </w:rPr>
+      </w:pPr>
+      <w:r>
+        <w:rPr>
+          <w:sz w:val="24"/>
+          <w:szCs w:val="24"/>
+        </w:rPr>
+        <w:t xml:space="preserve">Income </w:t>
+      </w:r>
+      <w:r>
+        <w:rPr>
+          <w:b/>
+          <w:bCs/>
+          <w:sz w:val="24"/>
+          <w:szCs w:val="24"/>
+        </w:rPr>
+        <w:t>muito baixo</w:t>
+      </w:r>
+    </w:p>
+    <w:p>
+      <w:pPr>
+        <w:pStyle w:val="PargrafodaLista"/>
+        <w:numPr>
+          <w:ilvl w:val="0"/>
+          <w:numId w:val="68"/>
+        </w:numPr>
+        <w:jc w:val="both"/>
+        <w:rPr>
+          <w:sz w:val="24"/>
+          <w:szCs w:val="24"/>
+        </w:rPr>
+      </w:pPr>
+      <w:proofErr w:type="spellStart"/>
+      <w:r>
+        <w:rPr>
+          <w:sz w:val="24"/>
+          <w:szCs w:val="24"/>
+        </w:rPr>
+        <w:t>gdpp</w:t>
+      </w:r>
+      <w:proofErr w:type="spellEnd"/>
+      <w:r>
+        <w:rPr>
+          <w:sz w:val="24"/>
+          <w:szCs w:val="24"/>
+        </w:rPr>
+        <w:t xml:space="preserve"> muito baixo</w:t>
+      </w:r>
+    </w:p>
+    <w:p>
+      <w:pPr>
+        <w:pStyle w:val="PargrafodaLista"/>
+        <w:numPr>
+          <w:ilvl w:val="0"/>
+          <w:numId w:val="68"/>
+        </w:numPr>
+        <w:jc w:val="both"/>
+        <w:rPr>
+          <w:sz w:val="24"/>
+          <w:szCs w:val="24"/>
+        </w:rPr>
+      </w:pPr>
+      <w:proofErr w:type="spellStart"/>
+      <w:r>
+        <w:rPr>
+          <w:sz w:val="24"/>
+          <w:szCs w:val="24"/>
+        </w:rPr>
+        <w:t>life_expec</w:t>
+      </w:r>
+      <w:proofErr w:type="spellEnd"/>
+      <w:r>
+        <w:rPr>
+          <w:sz w:val="24"/>
+          <w:szCs w:val="24"/>
+        </w:rPr>
+        <w:t xml:space="preserve"> muito baixa</w:t>
+      </w:r>
+    </w:p>
+    <w:p>
+      <w:pPr>
+        <w:pStyle w:val="PargrafodaLista"/>
+        <w:numPr>
+          <w:ilvl w:val="0"/>
+          <w:numId w:val="68"/>
+        </w:numPr>
+        <w:jc w:val="both"/>
+        <w:rPr>
+          <w:sz w:val="24"/>
+          <w:szCs w:val="24"/>
+        </w:rPr>
+      </w:pPr>
+      <w:proofErr w:type="spellStart"/>
+      <w:r>
+        <w:rPr>
+          <w:sz w:val="24"/>
+          <w:szCs w:val="24"/>
+        </w:rPr>
+        <w:t>child_mort</w:t>
+      </w:r>
+      <w:proofErr w:type="spellEnd"/>
+      <w:r>
+        <w:rPr>
+          <w:sz w:val="24"/>
+          <w:szCs w:val="24"/>
+        </w:rPr>
+        <w:t xml:space="preserve"> muito alta (um dos maiores indicadores)</w:t>
+      </w:r>
+    </w:p>
+    <w:p>
+      <w:pPr>
+        <w:pStyle w:val="PargrafodaLista"/>
+        <w:numPr>
+          <w:ilvl w:val="0"/>
+          <w:numId w:val="68"/>
+        </w:numPr>
+        <w:jc w:val="both"/>
+        <w:rPr>
+          <w:sz w:val="24"/>
+          <w:szCs w:val="24"/>
+        </w:rPr>
+      </w:pPr>
+      <w:proofErr w:type="spellStart"/>
+      <w:r>
+        <w:rPr>
+          <w:sz w:val="24"/>
+          <w:szCs w:val="24"/>
+        </w:rPr>
+        <w:t>total_fer</w:t>
+      </w:r>
+      <w:proofErr w:type="spellEnd"/>
+      <w:r>
+        <w:rPr>
+          <w:sz w:val="24"/>
+          <w:szCs w:val="24"/>
+        </w:rPr>
+        <w:t xml:space="preserve"> muito alto</w:t>
+      </w:r>
+    </w:p>
+    <w:p>
+      <w:pPr>
+        <w:pStyle w:val="PargrafodaLista"/>
+        <w:numPr>
+          <w:ilvl w:val="0"/>
+          <w:numId w:val="68"/>
+        </w:numPr>
+        <w:jc w:val="both"/>
+        <w:rPr>
+          <w:sz w:val="24"/>
+          <w:szCs w:val="24"/>
+        </w:rPr>
+      </w:pPr>
+      <w:r>
+        <w:rPr>
+          <w:sz w:val="24"/>
+          <w:szCs w:val="24"/>
+        </w:rPr>
+        <w:t>Baixa participação no comércio global</w:t>
+      </w:r>
+    </w:p>
+    <w:p>
+      <w:pPr>
+        <w:pStyle w:val="PargrafodaLista"/>
+        <w:jc w:val="both"/>
+        <w:rPr>
+          <w:sz w:val="24"/>
+          <w:szCs w:val="24"/>
+        </w:rPr>
+      </w:pPr>
+    </w:p>
+    <w:p>
+      <w:pPr>
+        <w:pStyle w:val="PargrafodaLista"/>
+        <w:ind w:left="0"/>
+        <w:jc w:val="both"/>
+        <w:rPr>
+          <w:sz w:val="24"/>
+          <w:szCs w:val="24"/>
+        </w:rPr>
+      </w:pPr>
+      <w:r>
+        <w:rPr>
+          <w:b/>
+          <w:bCs/>
+          <w:sz w:val="24"/>
+          <w:szCs w:val="24"/>
+        </w:rPr>
+        <w:t>Interpretação:</w:t>
+      </w:r>
+      <w:r>
+        <w:rPr>
+          <w:sz w:val="24"/>
+          <w:szCs w:val="24"/>
+        </w:rPr>
+        <w:br/>
+        <w:t xml:space="preserve">Este grupo representa países em </w:t>
+      </w:r>
+      <w:r>
+        <w:rPr>
+          <w:b/>
+          <w:bCs/>
+          <w:sz w:val="24"/>
+          <w:szCs w:val="24"/>
+        </w:rPr>
+        <w:t>condições severas de vulnerabilidade econômica e sanitária</w:t>
+      </w:r>
+      <w:r>
+        <w:rPr>
+          <w:sz w:val="24"/>
+          <w:szCs w:val="24"/>
+        </w:rPr>
+        <w:t>, com forte correlação entre pobreza estrutural, baixa qualidade de vida e altas taxas de mortalidade infantil.</w:t>
+      </w:r>
+    </w:p>
+    <w:p>
+      <w:pPr>
+        <w:pStyle w:val="PargrafodaLista"/>
+        <w:ind w:left="0"/>
+        <w:jc w:val="both"/>
+        <w:rPr>
+          <w:sz w:val="24"/>
+          <w:szCs w:val="24"/>
+        </w:rPr>
+      </w:pPr>
+      <w:r>
+        <w:rPr>
+          <w:b/>
+          <w:bCs/>
+          <w:sz w:val="24"/>
+          <w:szCs w:val="24"/>
+        </w:rPr>
+        <w:t>Exemplos típicos:</w:t>
+      </w:r>
+      <w:r>
+        <w:rPr>
+          <w:sz w:val="24"/>
+          <w:szCs w:val="24"/>
+        </w:rPr>
+        <w:t xml:space="preserve"> </w:t>
+      </w:r>
+      <w:r>
+        <w:rPr>
+          <w:rFonts w:ascii="Segoe UI Emoji" w:hAnsi="Segoe UI Emoji" w:cs="Segoe UI Emoji"/>
+          <w:sz w:val="24"/>
+          <w:szCs w:val="24"/>
+        </w:rPr>
+        <w:t>🇳🇪</w:t>
+      </w:r>
+      <w:r>
+        <w:rPr>
+          <w:sz w:val="24"/>
+          <w:szCs w:val="24"/>
+        </w:rPr>
+        <w:t xml:space="preserve"> Níger, </w:t>
+      </w:r>
+      <w:r>
+        <w:rPr>
+          <w:rFonts w:ascii="Segoe UI Emoji" w:hAnsi="Segoe UI Emoji" w:cs="Segoe UI Emoji"/>
+          <w:sz w:val="24"/>
+          <w:szCs w:val="24"/>
+        </w:rPr>
+        <w:t>🇨🇫</w:t>
+      </w:r>
+      <w:r>
+        <w:rPr>
+          <w:sz w:val="24"/>
+          <w:szCs w:val="24"/>
+        </w:rPr>
+        <w:t xml:space="preserve"> República Centro-Africana, </w:t>
+      </w:r>
+      <w:r>
+        <w:rPr>
+          <w:rFonts w:ascii="Segoe UI Emoji" w:hAnsi="Segoe UI Emoji" w:cs="Segoe UI Emoji"/>
+          <w:sz w:val="24"/>
+          <w:szCs w:val="24"/>
+        </w:rPr>
+        <w:t>🇦🇫</w:t>
+      </w:r>
+      <w:r>
+        <w:rPr>
+          <w:sz w:val="24"/>
+          <w:szCs w:val="24"/>
+        </w:rPr>
+        <w:t xml:space="preserve"> Afeganistão.</w:t>
+      </w:r>
+    </w:p>
+    <w:p>
+      <w:pPr>
+        <w:pStyle w:val="PargrafodaLista"/>
+        <w:ind w:left="0"/>
+        <w:jc w:val="both"/>
+        <w:rPr>
+          <w:sz w:val="24"/>
+          <w:szCs w:val="24"/>
+        </w:rPr>
+      </w:pPr>
+    </w:p>
+    <w:p>
+      <w:pPr>
+        <w:pStyle w:val="PargrafodaLista"/>
+        <w:ind w:left="0"/>
+        <w:jc w:val="both"/>
+        <w:rPr>
+          <w:sz w:val="24"/>
+          <w:szCs w:val="24"/>
+        </w:rPr>
+      </w:pPr>
+    </w:p>
+    <w:p>
+      <w:pPr>
+        <w:pStyle w:val="PargrafodaLista"/>
+        <w:ind w:left="0"/>
+        <w:jc w:val="both"/>
+        <w:rPr>
+          <w:sz w:val="24"/>
+          <w:szCs w:val="24"/>
+        </w:rPr>
+      </w:pPr>
+    </w:p>
+    <w:p>
+      <w:pPr>
+        <w:pStyle w:val="PargrafodaLista"/>
+        <w:ind w:left="0"/>
+        <w:jc w:val="both"/>
+        <w:rPr>
+          <w:b/>
+          <w:bCs/>
+          <w:sz w:val="24"/>
+          <w:szCs w:val="24"/>
+        </w:rPr>
+      </w:pPr>
+      <w:r>
+        <w:rPr>
+          <w:b/>
+          <w:bCs/>
+          <w:sz w:val="24"/>
+          <w:szCs w:val="24"/>
+        </w:rPr>
+        <w:t>Cluster 5 — Países com Forte Dependência Comercial e Variabilidade Econômica</w:t>
+      </w:r>
+    </w:p>
+    <w:p>
+      <w:pPr>
+        <w:pStyle w:val="PargrafodaLista"/>
+        <w:ind w:left="0"/>
+        <w:jc w:val="both"/>
+        <w:rPr>
+          <w:sz w:val="24"/>
+          <w:szCs w:val="24"/>
+        </w:rPr>
+      </w:pPr>
+      <w:r>
+        <w:rPr>
+          <w:b/>
+          <w:bCs/>
+          <w:sz w:val="24"/>
+          <w:szCs w:val="24"/>
+        </w:rPr>
+        <w:t>Perfil geral:</w:t>
+      </w:r>
+    </w:p>
+    <w:p>
+      <w:pPr>
+        <w:pStyle w:val="PargrafodaLista"/>
+        <w:numPr>
+          <w:ilvl w:val="0"/>
+          <w:numId w:val="69"/>
+        </w:numPr>
+        <w:jc w:val="both"/>
+        <w:rPr>
+          <w:sz w:val="24"/>
+          <w:szCs w:val="24"/>
+        </w:rPr>
+      </w:pPr>
+      <w:r>
+        <w:rPr>
+          <w:sz w:val="24"/>
+          <w:szCs w:val="24"/>
+        </w:rPr>
+        <w:t>Exportações muito altas ou importações muito altas</w:t>
+      </w:r>
+    </w:p>
+    <w:p>
+      <w:pPr>
+        <w:pStyle w:val="PargrafodaLista"/>
+        <w:numPr>
+          <w:ilvl w:val="0"/>
+          <w:numId w:val="69"/>
+        </w:numPr>
+        <w:jc w:val="both"/>
+        <w:rPr>
+          <w:sz w:val="24"/>
+          <w:szCs w:val="24"/>
+        </w:rPr>
+      </w:pPr>
+      <w:r>
+        <w:rPr>
+          <w:sz w:val="24"/>
+          <w:szCs w:val="24"/>
+        </w:rPr>
+        <w:t xml:space="preserve">Income e </w:t>
+      </w:r>
+      <w:proofErr w:type="spellStart"/>
+      <w:r>
+        <w:rPr>
+          <w:sz w:val="24"/>
+          <w:szCs w:val="24"/>
+        </w:rPr>
+        <w:t>gdpp</w:t>
+      </w:r>
+      <w:proofErr w:type="spellEnd"/>
+      <w:r>
+        <w:rPr>
+          <w:sz w:val="24"/>
+          <w:szCs w:val="24"/>
+        </w:rPr>
+        <w:t xml:space="preserve"> variáveis, podendo ser moderados</w:t>
+      </w:r>
+    </w:p>
+    <w:p>
+      <w:pPr>
+        <w:pStyle w:val="PargrafodaLista"/>
+        <w:numPr>
+          <w:ilvl w:val="0"/>
+          <w:numId w:val="69"/>
+        </w:numPr>
+        <w:jc w:val="both"/>
+        <w:rPr>
+          <w:sz w:val="24"/>
+          <w:szCs w:val="24"/>
+        </w:rPr>
+      </w:pPr>
+      <w:r>
+        <w:rPr>
+          <w:sz w:val="24"/>
+          <w:szCs w:val="24"/>
+        </w:rPr>
+        <w:t>Inflação instável</w:t>
+      </w:r>
+    </w:p>
+    <w:p>
+      <w:pPr>
+        <w:pStyle w:val="PargrafodaLista"/>
+        <w:numPr>
+          <w:ilvl w:val="0"/>
+          <w:numId w:val="69"/>
+        </w:numPr>
+        <w:jc w:val="both"/>
+        <w:rPr>
+          <w:sz w:val="24"/>
+          <w:szCs w:val="24"/>
+        </w:rPr>
+      </w:pPr>
+      <w:r>
+        <w:rPr>
+          <w:sz w:val="24"/>
+          <w:szCs w:val="24"/>
+        </w:rPr>
+        <w:t>Indicadores de saúde medianos</w:t>
+      </w:r>
+    </w:p>
+    <w:p>
+      <w:pPr>
+        <w:pStyle w:val="PargrafodaLista"/>
+        <w:numPr>
+          <w:ilvl w:val="0"/>
+          <w:numId w:val="69"/>
+        </w:numPr>
+        <w:jc w:val="both"/>
+        <w:rPr>
+          <w:sz w:val="24"/>
+          <w:szCs w:val="24"/>
+        </w:rPr>
+      </w:pPr>
+      <w:proofErr w:type="spellStart"/>
+      <w:r>
+        <w:rPr>
+          <w:sz w:val="24"/>
+          <w:szCs w:val="24"/>
+        </w:rPr>
+        <w:t>child_mort</w:t>
+      </w:r>
+      <w:proofErr w:type="spellEnd"/>
+      <w:r>
+        <w:rPr>
+          <w:sz w:val="24"/>
+          <w:szCs w:val="24"/>
+        </w:rPr>
+        <w:t xml:space="preserve"> moderada</w:t>
+      </w:r>
+    </w:p>
+    <w:p>
+      <w:pPr>
+        <w:pStyle w:val="PargrafodaLista"/>
+        <w:ind w:left="0"/>
+        <w:jc w:val="both"/>
+        <w:rPr>
+          <w:sz w:val="24"/>
+          <w:szCs w:val="24"/>
+        </w:rPr>
+      </w:pPr>
+      <w:r>
+        <w:rPr>
+          <w:b/>
+          <w:bCs/>
+          <w:sz w:val="24"/>
+          <w:szCs w:val="24"/>
+        </w:rPr>
+        <w:t>Interpretação:</w:t>
+      </w:r>
+      <w:r>
+        <w:rPr>
+          <w:sz w:val="24"/>
+          <w:szCs w:val="24"/>
+        </w:rPr>
+        <w:br/>
+        <w:t>Grupo marcado por comércio internacional altamente desbalanceado.</w:t>
+      </w:r>
+      <w:r>
+        <w:rPr>
+          <w:sz w:val="24"/>
+          <w:szCs w:val="24"/>
+        </w:rPr>
+        <w:br/>
+        <w:t>São países que dependem fortemente de commodities ou de importações essenciais.</w:t>
+      </w:r>
+      <w:r>
+        <w:rPr>
+          <w:sz w:val="24"/>
+          <w:szCs w:val="24"/>
+        </w:rPr>
+        <w:br/>
+        <w:t xml:space="preserve">Nem sempre são pobres, mas apresentam </w:t>
+      </w:r>
+      <w:r>
+        <w:rPr>
+          <w:i/>
+          <w:iCs/>
+          <w:sz w:val="24"/>
+          <w:szCs w:val="24"/>
+        </w:rPr>
+        <w:t>volatilidade econômica</w:t>
+      </w:r>
+      <w:r>
+        <w:rPr>
+          <w:sz w:val="24"/>
+          <w:szCs w:val="24"/>
+        </w:rPr>
+        <w:t xml:space="preserve"> ou estrutura produtiva limitada.</w:t>
+      </w:r>
+    </w:p>
+    <w:p>
+      <w:pPr>
+        <w:pStyle w:val="PargrafodaLista"/>
+        <w:ind w:left="0"/>
+        <w:jc w:val="both"/>
+        <w:rPr>
+          <w:sz w:val="24"/>
+          <w:szCs w:val="24"/>
+        </w:rPr>
+      </w:pPr>
+      <w:r>
+        <w:rPr>
+          <w:b/>
+          <w:bCs/>
+          <w:sz w:val="24"/>
+          <w:szCs w:val="24"/>
+        </w:rPr>
+        <w:lastRenderedPageBreak/>
+        <w:t>Exemplos típicos:</w:t>
+      </w:r>
+      <w:r>
+        <w:rPr>
+          <w:sz w:val="24"/>
+          <w:szCs w:val="24"/>
+        </w:rPr>
+        <w:t xml:space="preserve"> </w:t>
+      </w:r>
+      <w:r>
+        <w:rPr>
+          <w:rFonts w:ascii="Segoe UI Emoji" w:hAnsi="Segoe UI Emoji" w:cs="Segoe UI Emoji"/>
+          <w:sz w:val="24"/>
+          <w:szCs w:val="24"/>
+        </w:rPr>
+        <w:t>🇶🇦</w:t>
+      </w:r>
+      <w:r>
+        <w:rPr>
+          <w:sz w:val="24"/>
+          <w:szCs w:val="24"/>
+        </w:rPr>
+        <w:t xml:space="preserve"> Qatar, </w:t>
+      </w:r>
+      <w:r>
+        <w:rPr>
+          <w:rFonts w:ascii="Segoe UI Emoji" w:hAnsi="Segoe UI Emoji" w:cs="Segoe UI Emoji"/>
+          <w:sz w:val="24"/>
+          <w:szCs w:val="24"/>
+        </w:rPr>
+        <w:t>🇦🇿</w:t>
+      </w:r>
+      <w:r>
+        <w:rPr>
+          <w:sz w:val="24"/>
+          <w:szCs w:val="24"/>
+        </w:rPr>
+        <w:t xml:space="preserve"> Azerbaijão, </w:t>
+      </w:r>
+      <w:r>
+        <w:rPr>
+          <w:rFonts w:ascii="Segoe UI Emoji" w:hAnsi="Segoe UI Emoji" w:cs="Segoe UI Emoji"/>
+          <w:sz w:val="24"/>
+          <w:szCs w:val="24"/>
+        </w:rPr>
+        <w:t>🇰🇿</w:t>
+      </w:r>
+      <w:r>
+        <w:rPr>
+          <w:sz w:val="24"/>
+          <w:szCs w:val="24"/>
+        </w:rPr>
+        <w:t xml:space="preserve"> Cazaquistão (dependência de petróleo/gás).</w:t>
+      </w:r>
+    </w:p>
+    <w:p>
+      <w:pPr>
+        <w:pStyle w:val="PargrafodaLista"/>
+        <w:ind w:left="0"/>
+        <w:jc w:val="both"/>
+        <w:rPr>
+          <w:sz w:val="24"/>
+          <w:szCs w:val="24"/>
+        </w:rPr>
+      </w:pPr>
+    </w:p>
+    <w:p>
+      <w:pPr>
+        <w:pStyle w:val="PargrafodaLista"/>
+        <w:ind w:left="0"/>
+        <w:jc w:val="both"/>
+        <w:rPr>
+          <w:sz w:val="24"/>
+          <w:szCs w:val="24"/>
+        </w:rPr>
+      </w:pPr>
+    </w:p>
     <w:sectPr>
       <w:pgSz w:w="11906" w:h="16838"/>
       <w:pgMar w:top="1417" w:right="1701" w:bottom="1417" w:left="1701" w:header="708" w:footer="708" w:gutter="0"/>
@@ -11139,6 +13270,155 @@
     </w:lvl>
   </w:abstractNum>
   <w:abstractNum w:abstractNumId="21" w15:restartNumberingAfterBreak="0">
+    <w:nsid w:val="2CDD6285"/>
+    <w:multiLevelType w:val="multilevel"/>
+    <w:tmpl w:val="A3023298"/>
+    <w:lvl w:ilvl="0">
+      <w:start w:val="1"/>
+      <w:numFmt w:val="bullet"/>
+      <w:lvlText w:val=""/>
+      <w:lvlJc w:val="left"/>
+      <w:pPr>
+        <w:tabs>
+          <w:tab w:val="num" w:pos="720"/>
+        </w:tabs>
+        <w:ind w:left="720" w:hanging="360"/>
+      </w:pPr>
+      <w:rPr>
+        <w:rFonts w:ascii="Symbol" w:hAnsi="Symbol" w:hint="default"/>
+        <w:sz w:val="20"/>
+      </w:rPr>
+    </w:lvl>
+    <w:lvl w:ilvl="1" w:tentative="1">
+      <w:start w:val="1"/>
+      <w:numFmt w:val="bullet"/>
+      <w:lvlText w:val="o"/>
+      <w:lvlJc w:val="left"/>
+      <w:pPr>
+        <w:tabs>
+          <w:tab w:val="num" w:pos="1440"/>
+        </w:tabs>
+        <w:ind w:left="1440" w:hanging="360"/>
+      </w:pPr>
+      <w:rPr>
+        <w:rFonts w:ascii="Courier New" w:hAnsi="Courier New" w:hint="default"/>
+        <w:sz w:val="20"/>
+      </w:rPr>
+    </w:lvl>
+    <w:lvl w:ilvl="2" w:tentative="1">
+      <w:start w:val="1"/>
+      <w:numFmt w:val="bullet"/>
+      <w:lvlText w:val=""/>
+      <w:lvlJc w:val="left"/>
+      <w:pPr>
+        <w:tabs>
+          <w:tab w:val="num" w:pos="2160"/>
+        </w:tabs>
+        <w:ind w:left="2160" w:hanging="360"/>
+      </w:pPr>
+      <w:rPr>
+        <w:rFonts w:ascii="Wingdings" w:hAnsi="Wingdings" w:hint="default"/>
+        <w:sz w:val="20"/>
+      </w:rPr>
+    </w:lvl>
+    <w:lvl w:ilvl="3" w:tentative="1">
+      <w:start w:val="1"/>
+      <w:numFmt w:val="bullet"/>
+      <w:lvlText w:val=""/>
+      <w:lvlJc w:val="left"/>
+      <w:pPr>
+        <w:tabs>
+          <w:tab w:val="num" w:pos="2880"/>
+        </w:tabs>
+        <w:ind w:left="2880" w:hanging="360"/>
+      </w:pPr>
+      <w:rPr>
+        <w:rFonts w:ascii="Wingdings" w:hAnsi="Wingdings" w:hint="default"/>
+        <w:sz w:val="20"/>
+      </w:rPr>
+    </w:lvl>
+    <w:lvl w:ilvl="4" w:tentative="1">
+      <w:start w:val="1"/>
+      <w:numFmt w:val="bullet"/>
+      <w:lvlText w:val=""/>
+      <w:lvlJc w:val="left"/>
+      <w:pPr>
+        <w:tabs>
+          <w:tab w:val="num" w:pos="3600"/>
+        </w:tabs>
+        <w:ind w:left="3600" w:hanging="360"/>
+      </w:pPr>
+      <w:rPr>
+        <w:rFonts w:ascii="Wingdings" w:hAnsi="Wingdings" w:hint="default"/>
+        <w:sz w:val="20"/>
+      </w:rPr>
+    </w:lvl>
+    <w:lvl w:ilvl="5" w:tentative="1">
+      <w:start w:val="1"/>
+      <w:numFmt w:val="bullet"/>
+      <w:lvlText w:val=""/>
+      <w:lvlJc w:val="left"/>
+      <w:pPr>
+        <w:tabs>
+          <w:tab w:val="num" w:pos="4320"/>
+        </w:tabs>
+        <w:ind w:left="4320" w:hanging="360"/>
+      </w:pPr>
+      <w:rPr>
+        <w:rFonts w:ascii="Wingdings" w:hAnsi="Wingdings" w:hint="default"/>
+        <w:sz w:val="20"/>
+      </w:rPr>
+    </w:lvl>
+    <w:lvl w:ilvl="6" w:tentative="1">
+      <w:start w:val="1"/>
+      <w:numFmt w:val="bullet"/>
+      <w:lvlText w:val=""/>
+      <w:lvlJc w:val="left"/>
+      <w:pPr>
+        <w:tabs>
+          <w:tab w:val="num" w:pos="5040"/>
+        </w:tabs>
+        <w:ind w:left="5040" w:hanging="360"/>
+      </w:pPr>
+      <w:rPr>
+        <w:rFonts w:ascii="Wingdings" w:hAnsi="Wingdings" w:hint="default"/>
+        <w:sz w:val="20"/>
+      </w:rPr>
+    </w:lvl>
+    <w:lvl w:ilvl="7" w:tentative="1">
+      <w:start w:val="1"/>
+      <w:numFmt w:val="bullet"/>
+      <w:lvlText w:val=""/>
+      <w:lvlJc w:val="left"/>
+      <w:pPr>
+        <w:tabs>
+          <w:tab w:val="num" w:pos="5760"/>
+        </w:tabs>
+        <w:ind w:left="5760" w:hanging="360"/>
+      </w:pPr>
+      <w:rPr>
+        <w:rFonts w:ascii="Wingdings" w:hAnsi="Wingdings" w:hint="default"/>
+        <w:sz w:val="20"/>
+      </w:rPr>
+    </w:lvl>
+    <w:lvl w:ilvl="8" w:tentative="1">
+      <w:start w:val="1"/>
+      <w:numFmt w:val="bullet"/>
+      <w:lvlText w:val=""/>
+      <w:lvlJc w:val="left"/>
+      <w:pPr>
+        <w:tabs>
+          <w:tab w:val="num" w:pos="6480"/>
+        </w:tabs>
+        <w:ind w:left="6480" w:hanging="360"/>
+      </w:pPr>
+      <w:rPr>
+        <w:rFonts w:ascii="Wingdings" w:hAnsi="Wingdings" w:hint="default"/>
+        <w:sz w:val="20"/>
+      </w:rPr>
+    </w:lvl>
+  </w:abstractNum>
+  <w:abstractNum w:abstractNumId="22" w15:restartNumberingAfterBreak="0">
     <w:nsid w:val="2FA768BF"/>
     <w:multiLevelType w:val="multilevel"/>
     <w:tmpl w:val="78780B5A"/>
@@ -11287,7 +13567,7 @@
       </w:rPr>
     </w:lvl>
   </w:abstractNum>
-  <w:abstractNum w:abstractNumId="22" w15:restartNumberingAfterBreak="0">
+  <w:abstractNum w:abstractNumId="23" w15:restartNumberingAfterBreak="0">
     <w:nsid w:val="2FB03A2A"/>
     <w:multiLevelType w:val="multilevel"/>
     <w:tmpl w:val="40963FD4"/>
@@ -11436,7 +13716,7 @@
       </w:rPr>
     </w:lvl>
   </w:abstractNum>
-  <w:abstractNum w:abstractNumId="23" w15:restartNumberingAfterBreak="0">
+  <w:abstractNum w:abstractNumId="24" w15:restartNumberingAfterBreak="0">
     <w:nsid w:val="31C7596D"/>
     <w:multiLevelType w:val="multilevel"/>
     <w:tmpl w:val="E00E15B6"/>
@@ -11585,7 +13865,7 @@
       </w:rPr>
     </w:lvl>
   </w:abstractNum>
-  <w:abstractNum w:abstractNumId="24" w15:restartNumberingAfterBreak="0">
+  <w:abstractNum w:abstractNumId="25" w15:restartNumberingAfterBreak="0">
     <w:nsid w:val="321E6290"/>
     <w:multiLevelType w:val="multilevel"/>
     <w:tmpl w:val="7806F180"/>
@@ -11698,7 +13978,7 @@
       </w:pPr>
     </w:lvl>
   </w:abstractNum>
-  <w:abstractNum w:abstractNumId="25" w15:restartNumberingAfterBreak="0">
+  <w:abstractNum w:abstractNumId="26" w15:restartNumberingAfterBreak="0">
     <w:nsid w:val="348353F2"/>
     <w:multiLevelType w:val="multilevel"/>
     <w:tmpl w:val="6B3AEC44"/>
@@ -11847,7 +14127,7 @@
       </w:rPr>
     </w:lvl>
   </w:abstractNum>
-  <w:abstractNum w:abstractNumId="26" w15:restartNumberingAfterBreak="0">
+  <w:abstractNum w:abstractNumId="27" w15:restartNumberingAfterBreak="0">
     <w:nsid w:val="35083A8D"/>
     <w:multiLevelType w:val="multilevel"/>
     <w:tmpl w:val="E3E699A4"/>
@@ -11996,7 +14276,7 @@
       </w:rPr>
     </w:lvl>
   </w:abstractNum>
-  <w:abstractNum w:abstractNumId="27" w15:restartNumberingAfterBreak="0">
+  <w:abstractNum w:abstractNumId="28" w15:restartNumberingAfterBreak="0">
     <w:nsid w:val="36922CF8"/>
     <w:multiLevelType w:val="hybridMultilevel"/>
     <w:tmpl w:val="E0F0003A"/>
@@ -12109,7 +14389,7 @@
       </w:rPr>
     </w:lvl>
   </w:abstractNum>
-  <w:abstractNum w:abstractNumId="28" w15:restartNumberingAfterBreak="0">
+  <w:abstractNum w:abstractNumId="29" w15:restartNumberingAfterBreak="0">
     <w:nsid w:val="3C7338C0"/>
     <w:multiLevelType w:val="multilevel"/>
     <w:tmpl w:val="B1EC2DF2"/>
@@ -12258,7 +14538,7 @@
       </w:rPr>
     </w:lvl>
   </w:abstractNum>
-  <w:abstractNum w:abstractNumId="29" w15:restartNumberingAfterBreak="0">
+  <w:abstractNum w:abstractNumId="30" w15:restartNumberingAfterBreak="0">
     <w:nsid w:val="3CFD0591"/>
     <w:multiLevelType w:val="multilevel"/>
     <w:tmpl w:val="92180FA8"/>
@@ -12371,7 +14651,7 @@
       </w:pPr>
     </w:lvl>
   </w:abstractNum>
-  <w:abstractNum w:abstractNumId="30" w15:restartNumberingAfterBreak="0">
+  <w:abstractNum w:abstractNumId="31" w15:restartNumberingAfterBreak="0">
     <w:nsid w:val="402058FB"/>
     <w:multiLevelType w:val="multilevel"/>
     <w:tmpl w:val="95FC6A86"/>
@@ -12484,7 +14764,7 @@
       </w:pPr>
     </w:lvl>
   </w:abstractNum>
-  <w:abstractNum w:abstractNumId="31" w15:restartNumberingAfterBreak="0">
+  <w:abstractNum w:abstractNumId="32" w15:restartNumberingAfterBreak="0">
     <w:nsid w:val="4205057C"/>
     <w:multiLevelType w:val="multilevel"/>
     <w:tmpl w:val="508EEC9C"/>
@@ -12633,7 +14913,156 @@
       </w:rPr>
     </w:lvl>
   </w:abstractNum>
-  <w:abstractNum w:abstractNumId="32" w15:restartNumberingAfterBreak="0">
+  <w:abstractNum w:abstractNumId="33" w15:restartNumberingAfterBreak="0">
+    <w:nsid w:val="43D507DE"/>
+    <w:multiLevelType w:val="multilevel"/>
+    <w:tmpl w:val="0AF8078A"/>
+    <w:lvl w:ilvl="0">
+      <w:start w:val="1"/>
+      <w:numFmt w:val="bullet"/>
+      <w:lvlText w:val=""/>
+      <w:lvlJc w:val="left"/>
+      <w:pPr>
+        <w:tabs>
+          <w:tab w:val="num" w:pos="720"/>
+        </w:tabs>
+        <w:ind w:left="720" w:hanging="360"/>
+      </w:pPr>
+      <w:rPr>
+        <w:rFonts w:ascii="Symbol" w:hAnsi="Symbol" w:hint="default"/>
+        <w:sz w:val="20"/>
+      </w:rPr>
+    </w:lvl>
+    <w:lvl w:ilvl="1" w:tentative="1">
+      <w:start w:val="1"/>
+      <w:numFmt w:val="bullet"/>
+      <w:lvlText w:val="o"/>
+      <w:lvlJc w:val="left"/>
+      <w:pPr>
+        <w:tabs>
+          <w:tab w:val="num" w:pos="1440"/>
+        </w:tabs>
+        <w:ind w:left="1440" w:hanging="360"/>
+      </w:pPr>
+      <w:rPr>
+        <w:rFonts w:ascii="Courier New" w:hAnsi="Courier New" w:hint="default"/>
+        <w:sz w:val="20"/>
+      </w:rPr>
+    </w:lvl>
+    <w:lvl w:ilvl="2" w:tentative="1">
+      <w:start w:val="1"/>
+      <w:numFmt w:val="bullet"/>
+      <w:lvlText w:val=""/>
+      <w:lvlJc w:val="left"/>
+      <w:pPr>
+        <w:tabs>
+          <w:tab w:val="num" w:pos="2160"/>
+        </w:tabs>
+        <w:ind w:left="2160" w:hanging="360"/>
+      </w:pPr>
+      <w:rPr>
+        <w:rFonts w:ascii="Wingdings" w:hAnsi="Wingdings" w:hint="default"/>
+        <w:sz w:val="20"/>
+      </w:rPr>
+    </w:lvl>
+    <w:lvl w:ilvl="3" w:tentative="1">
+      <w:start w:val="1"/>
+      <w:numFmt w:val="bullet"/>
+      <w:lvlText w:val=""/>
+      <w:lvlJc w:val="left"/>
+      <w:pPr>
+        <w:tabs>
+          <w:tab w:val="num" w:pos="2880"/>
+        </w:tabs>
+        <w:ind w:left="2880" w:hanging="360"/>
+      </w:pPr>
+      <w:rPr>
+        <w:rFonts w:ascii="Wingdings" w:hAnsi="Wingdings" w:hint="default"/>
+        <w:sz w:val="20"/>
+      </w:rPr>
+    </w:lvl>
+    <w:lvl w:ilvl="4" w:tentative="1">
+      <w:start w:val="1"/>
+      <w:numFmt w:val="bullet"/>
+      <w:lvlText w:val=""/>
+      <w:lvlJc w:val="left"/>
+      <w:pPr>
+        <w:tabs>
+          <w:tab w:val="num" w:pos="3600"/>
+        </w:tabs>
+        <w:ind w:left="3600" w:hanging="360"/>
+      </w:pPr>
+      <w:rPr>
+        <w:rFonts w:ascii="Wingdings" w:hAnsi="Wingdings" w:hint="default"/>
+        <w:sz w:val="20"/>
+      </w:rPr>
+    </w:lvl>
+    <w:lvl w:ilvl="5" w:tentative="1">
+      <w:start w:val="1"/>
+      <w:numFmt w:val="bullet"/>
+      <w:lvlText w:val=""/>
+      <w:lvlJc w:val="left"/>
+      <w:pPr>
+        <w:tabs>
+          <w:tab w:val="num" w:pos="4320"/>
+        </w:tabs>
+        <w:ind w:left="4320" w:hanging="360"/>
+      </w:pPr>
+      <w:rPr>
+        <w:rFonts w:ascii="Wingdings" w:hAnsi="Wingdings" w:hint="default"/>
+        <w:sz w:val="20"/>
+      </w:rPr>
+    </w:lvl>
+    <w:lvl w:ilvl="6" w:tentative="1">
+      <w:start w:val="1"/>
+      <w:numFmt w:val="bullet"/>
+      <w:lvlText w:val=""/>
+      <w:lvlJc w:val="left"/>
+      <w:pPr>
+        <w:tabs>
+          <w:tab w:val="num" w:pos="5040"/>
+        </w:tabs>
+        <w:ind w:left="5040" w:hanging="360"/>
+      </w:pPr>
+      <w:rPr>
+        <w:rFonts w:ascii="Wingdings" w:hAnsi="Wingdings" w:hint="default"/>
+        <w:sz w:val="20"/>
+      </w:rPr>
+    </w:lvl>
+    <w:lvl w:ilvl="7" w:tentative="1">
+      <w:start w:val="1"/>
+      <w:numFmt w:val="bullet"/>
+      <w:lvlText w:val=""/>
+      <w:lvlJc w:val="left"/>
+      <w:pPr>
+        <w:tabs>
+          <w:tab w:val="num" w:pos="5760"/>
+        </w:tabs>
+        <w:ind w:left="5760" w:hanging="360"/>
+      </w:pPr>
+      <w:rPr>
+        <w:rFonts w:ascii="Wingdings" w:hAnsi="Wingdings" w:hint="default"/>
+        <w:sz w:val="20"/>
+      </w:rPr>
+    </w:lvl>
+    <w:lvl w:ilvl="8" w:tentative="1">
+      <w:start w:val="1"/>
+      <w:numFmt w:val="bullet"/>
+      <w:lvlText w:val=""/>
+      <w:lvlJc w:val="left"/>
+      <w:pPr>
+        <w:tabs>
+          <w:tab w:val="num" w:pos="6480"/>
+        </w:tabs>
+        <w:ind w:left="6480" w:hanging="360"/>
+      </w:pPr>
+      <w:rPr>
+        <w:rFonts w:ascii="Wingdings" w:hAnsi="Wingdings" w:hint="default"/>
+        <w:sz w:val="20"/>
+      </w:rPr>
+    </w:lvl>
+  </w:abstractNum>
+  <w:abstractNum w:abstractNumId="34" w15:restartNumberingAfterBreak="0">
     <w:nsid w:val="48DC5643"/>
     <w:multiLevelType w:val="multilevel"/>
     <w:tmpl w:val="0500135E"/>
@@ -12782,7 +15211,7 @@
       </w:rPr>
     </w:lvl>
   </w:abstractNum>
-  <w:abstractNum w:abstractNumId="33" w15:restartNumberingAfterBreak="0">
+  <w:abstractNum w:abstractNumId="35" w15:restartNumberingAfterBreak="0">
     <w:nsid w:val="4904515D"/>
     <w:multiLevelType w:val="hybridMultilevel"/>
     <w:tmpl w:val="2D2C4B86"/>
@@ -12895,7 +15324,7 @@
       </w:rPr>
     </w:lvl>
   </w:abstractNum>
-  <w:abstractNum w:abstractNumId="34" w15:restartNumberingAfterBreak="0">
+  <w:abstractNum w:abstractNumId="36" w15:restartNumberingAfterBreak="0">
     <w:nsid w:val="497D08F7"/>
     <w:multiLevelType w:val="hybridMultilevel"/>
     <w:tmpl w:val="5AFE3B9E"/>
@@ -13008,7 +15437,7 @@
       </w:rPr>
     </w:lvl>
   </w:abstractNum>
-  <w:abstractNum w:abstractNumId="35" w15:restartNumberingAfterBreak="0">
+  <w:abstractNum w:abstractNumId="37" w15:restartNumberingAfterBreak="0">
     <w:nsid w:val="4A893438"/>
     <w:multiLevelType w:val="multilevel"/>
     <w:tmpl w:val="309AF3FC"/>
@@ -13121,7 +15550,7 @@
       </w:pPr>
     </w:lvl>
   </w:abstractNum>
-  <w:abstractNum w:abstractNumId="36" w15:restartNumberingAfterBreak="0">
+  <w:abstractNum w:abstractNumId="38" w15:restartNumberingAfterBreak="0">
     <w:nsid w:val="4C534342"/>
     <w:multiLevelType w:val="multilevel"/>
     <w:tmpl w:val="DE02A6B0"/>
@@ -13270,7 +15699,7 @@
       </w:rPr>
     </w:lvl>
   </w:abstractNum>
-  <w:abstractNum w:abstractNumId="37" w15:restartNumberingAfterBreak="0">
+  <w:abstractNum w:abstractNumId="39" w15:restartNumberingAfterBreak="0">
     <w:nsid w:val="51C11280"/>
     <w:multiLevelType w:val="multilevel"/>
     <w:tmpl w:val="D0F6F734"/>
@@ -13419,7 +15848,7 @@
       </w:rPr>
     </w:lvl>
   </w:abstractNum>
-  <w:abstractNum w:abstractNumId="38" w15:restartNumberingAfterBreak="0">
+  <w:abstractNum w:abstractNumId="40" w15:restartNumberingAfterBreak="0">
     <w:nsid w:val="549D547E"/>
     <w:multiLevelType w:val="multilevel"/>
     <w:tmpl w:val="6D9088B0"/>
@@ -13532,7 +15961,7 @@
       </w:pPr>
     </w:lvl>
   </w:abstractNum>
-  <w:abstractNum w:abstractNumId="39" w15:restartNumberingAfterBreak="0">
+  <w:abstractNum w:abstractNumId="41" w15:restartNumberingAfterBreak="0">
     <w:nsid w:val="54E93534"/>
     <w:multiLevelType w:val="multilevel"/>
     <w:tmpl w:val="975416D6"/>
@@ -13645,7 +16074,7 @@
       </w:pPr>
     </w:lvl>
   </w:abstractNum>
-  <w:abstractNum w:abstractNumId="40" w15:restartNumberingAfterBreak="0">
+  <w:abstractNum w:abstractNumId="42" w15:restartNumberingAfterBreak="0">
     <w:nsid w:val="5B6F6CDD"/>
     <w:multiLevelType w:val="multilevel"/>
     <w:tmpl w:val="63E6FD76"/>
@@ -13758,7 +16187,7 @@
       </w:pPr>
     </w:lvl>
   </w:abstractNum>
-  <w:abstractNum w:abstractNumId="41" w15:restartNumberingAfterBreak="0">
+  <w:abstractNum w:abstractNumId="43" w15:restartNumberingAfterBreak="0">
     <w:nsid w:val="5EB75A7B"/>
     <w:multiLevelType w:val="multilevel"/>
     <w:tmpl w:val="5D90D0B2"/>
@@ -13871,7 +16300,7 @@
       </w:pPr>
     </w:lvl>
   </w:abstractNum>
-  <w:abstractNum w:abstractNumId="42" w15:restartNumberingAfterBreak="0">
+  <w:abstractNum w:abstractNumId="44" w15:restartNumberingAfterBreak="0">
     <w:nsid w:val="5EC207FF"/>
     <w:multiLevelType w:val="multilevel"/>
     <w:tmpl w:val="CE68E0D4"/>
@@ -14020,7 +16449,7 @@
       </w:rPr>
     </w:lvl>
   </w:abstractNum>
-  <w:abstractNum w:abstractNumId="43" w15:restartNumberingAfterBreak="0">
+  <w:abstractNum w:abstractNumId="45" w15:restartNumberingAfterBreak="0">
     <w:nsid w:val="63AC1BDD"/>
     <w:multiLevelType w:val="multilevel"/>
     <w:tmpl w:val="37F8891C"/>
@@ -14169,7 +16598,156 @@
       </w:rPr>
     </w:lvl>
   </w:abstractNum>
-  <w:abstractNum w:abstractNumId="44" w15:restartNumberingAfterBreak="0">
+  <w:abstractNum w:abstractNumId="46" w15:restartNumberingAfterBreak="0">
+    <w:nsid w:val="64C5206A"/>
+    <w:multiLevelType w:val="multilevel"/>
+    <w:tmpl w:val="91CE1C54"/>
+    <w:lvl w:ilvl="0">
+      <w:start w:val="1"/>
+      <w:numFmt w:val="bullet"/>
+      <w:lvlText w:val=""/>
+      <w:lvlJc w:val="left"/>
+      <w:pPr>
+        <w:tabs>
+          <w:tab w:val="num" w:pos="720"/>
+        </w:tabs>
+        <w:ind w:left="720" w:hanging="360"/>
+      </w:pPr>
+      <w:rPr>
+        <w:rFonts w:ascii="Symbol" w:hAnsi="Symbol" w:hint="default"/>
+        <w:sz w:val="20"/>
+      </w:rPr>
+    </w:lvl>
+    <w:lvl w:ilvl="1" w:tentative="1">
+      <w:start w:val="1"/>
+      <w:numFmt w:val="bullet"/>
+      <w:lvlText w:val="o"/>
+      <w:lvlJc w:val="left"/>
+      <w:pPr>
+        <w:tabs>
+          <w:tab w:val="num" w:pos="1440"/>
+        </w:tabs>
+        <w:ind w:left="1440" w:hanging="360"/>
+      </w:pPr>
+      <w:rPr>
+        <w:rFonts w:ascii="Courier New" w:hAnsi="Courier New" w:hint="default"/>
+        <w:sz w:val="20"/>
+      </w:rPr>
+    </w:lvl>
+    <w:lvl w:ilvl="2" w:tentative="1">
+      <w:start w:val="1"/>
+      <w:numFmt w:val="bullet"/>
+      <w:lvlText w:val=""/>
+      <w:lvlJc w:val="left"/>
+      <w:pPr>
+        <w:tabs>
+          <w:tab w:val="num" w:pos="2160"/>
+        </w:tabs>
+        <w:ind w:left="2160" w:hanging="360"/>
+      </w:pPr>
+      <w:rPr>
+        <w:rFonts w:ascii="Wingdings" w:hAnsi="Wingdings" w:hint="default"/>
+        <w:sz w:val="20"/>
+      </w:rPr>
+    </w:lvl>
+    <w:lvl w:ilvl="3" w:tentative="1">
+      <w:start w:val="1"/>
+      <w:numFmt w:val="bullet"/>
+      <w:lvlText w:val=""/>
+      <w:lvlJc w:val="left"/>
+      <w:pPr>
+        <w:tabs>
+          <w:tab w:val="num" w:pos="2880"/>
+        </w:tabs>
+        <w:ind w:left="2880" w:hanging="360"/>
+      </w:pPr>
+      <w:rPr>
+        <w:rFonts w:ascii="Wingdings" w:hAnsi="Wingdings" w:hint="default"/>
+        <w:sz w:val="20"/>
+      </w:rPr>
+    </w:lvl>
+    <w:lvl w:ilvl="4" w:tentative="1">
+      <w:start w:val="1"/>
+      <w:numFmt w:val="bullet"/>
+      <w:lvlText w:val=""/>
+      <w:lvlJc w:val="left"/>
+      <w:pPr>
+        <w:tabs>
+          <w:tab w:val="num" w:pos="3600"/>
+        </w:tabs>
+        <w:ind w:left="3600" w:hanging="360"/>
+      </w:pPr>
+      <w:rPr>
+        <w:rFonts w:ascii="Wingdings" w:hAnsi="Wingdings" w:hint="default"/>
+        <w:sz w:val="20"/>
+      </w:rPr>
+    </w:lvl>
+    <w:lvl w:ilvl="5" w:tentative="1">
+      <w:start w:val="1"/>
+      <w:numFmt w:val="bullet"/>
+      <w:lvlText w:val=""/>
+      <w:lvlJc w:val="left"/>
+      <w:pPr>
+        <w:tabs>
+          <w:tab w:val="num" w:pos="4320"/>
+        </w:tabs>
+        <w:ind w:left="4320" w:hanging="360"/>
+      </w:pPr>
+      <w:rPr>
+        <w:rFonts w:ascii="Wingdings" w:hAnsi="Wingdings" w:hint="default"/>
+        <w:sz w:val="20"/>
+      </w:rPr>
+    </w:lvl>
+    <w:lvl w:ilvl="6" w:tentative="1">
+      <w:start w:val="1"/>
+      <w:numFmt w:val="bullet"/>
+      <w:lvlText w:val=""/>
+      <w:lvlJc w:val="left"/>
+      <w:pPr>
+        <w:tabs>
+          <w:tab w:val="num" w:pos="5040"/>
+        </w:tabs>
+        <w:ind w:left="5040" w:hanging="360"/>
+      </w:pPr>
+      <w:rPr>
+        <w:rFonts w:ascii="Wingdings" w:hAnsi="Wingdings" w:hint="default"/>
+        <w:sz w:val="20"/>
+      </w:rPr>
+    </w:lvl>
+    <w:lvl w:ilvl="7" w:tentative="1">
+      <w:start w:val="1"/>
+      <w:numFmt w:val="bullet"/>
+      <w:lvlText w:val=""/>
+      <w:lvlJc w:val="left"/>
+      <w:pPr>
+        <w:tabs>
+          <w:tab w:val="num" w:pos="5760"/>
+        </w:tabs>
+        <w:ind w:left="5760" w:hanging="360"/>
+      </w:pPr>
+      <w:rPr>
+        <w:rFonts w:ascii="Wingdings" w:hAnsi="Wingdings" w:hint="default"/>
+        <w:sz w:val="20"/>
+      </w:rPr>
+    </w:lvl>
+    <w:lvl w:ilvl="8" w:tentative="1">
+      <w:start w:val="1"/>
+      <w:numFmt w:val="bullet"/>
+      <w:lvlText w:val=""/>
+      <w:lvlJc w:val="left"/>
+      <w:pPr>
+        <w:tabs>
+          <w:tab w:val="num" w:pos="6480"/>
+        </w:tabs>
+        <w:ind w:left="6480" w:hanging="360"/>
+      </w:pPr>
+      <w:rPr>
+        <w:rFonts w:ascii="Wingdings" w:hAnsi="Wingdings" w:hint="default"/>
+        <w:sz w:val="20"/>
+      </w:rPr>
+    </w:lvl>
+  </w:abstractNum>
+  <w:abstractNum w:abstractNumId="47" w15:restartNumberingAfterBreak="0">
     <w:nsid w:val="66076018"/>
     <w:multiLevelType w:val="multilevel"/>
     <w:tmpl w:val="6492943E"/>
@@ -14318,7 +16896,7 @@
       </w:rPr>
     </w:lvl>
   </w:abstractNum>
-  <w:abstractNum w:abstractNumId="45" w15:restartNumberingAfterBreak="0">
+  <w:abstractNum w:abstractNumId="48" w15:restartNumberingAfterBreak="0">
     <w:nsid w:val="6643570B"/>
     <w:multiLevelType w:val="multilevel"/>
     <w:tmpl w:val="34EA3FE0"/>
@@ -14467,7 +17045,7 @@
       </w:rPr>
     </w:lvl>
   </w:abstractNum>
-  <w:abstractNum w:abstractNumId="46" w15:restartNumberingAfterBreak="0">
+  <w:abstractNum w:abstractNumId="49" w15:restartNumberingAfterBreak="0">
     <w:nsid w:val="68234D07"/>
     <w:multiLevelType w:val="hybridMultilevel"/>
     <w:tmpl w:val="70A041DA"/>
@@ -14580,7 +17158,156 @@
       </w:rPr>
     </w:lvl>
   </w:abstractNum>
-  <w:abstractNum w:abstractNumId="47" w15:restartNumberingAfterBreak="0">
+  <w:abstractNum w:abstractNumId="50" w15:restartNumberingAfterBreak="0">
+    <w:nsid w:val="68490282"/>
+    <w:multiLevelType w:val="multilevel"/>
+    <w:tmpl w:val="EC3EB766"/>
+    <w:lvl w:ilvl="0">
+      <w:start w:val="1"/>
+      <w:numFmt w:val="bullet"/>
+      <w:lvlText w:val=""/>
+      <w:lvlJc w:val="left"/>
+      <w:pPr>
+        <w:tabs>
+          <w:tab w:val="num" w:pos="720"/>
+        </w:tabs>
+        <w:ind w:left="720" w:hanging="360"/>
+      </w:pPr>
+      <w:rPr>
+        <w:rFonts w:ascii="Symbol" w:hAnsi="Symbol" w:hint="default"/>
+        <w:sz w:val="20"/>
+      </w:rPr>
+    </w:lvl>
+    <w:lvl w:ilvl="1" w:tentative="1">
+      <w:start w:val="1"/>
+      <w:numFmt w:val="bullet"/>
+      <w:lvlText w:val="o"/>
+      <w:lvlJc w:val="left"/>
+      <w:pPr>
+        <w:tabs>
+          <w:tab w:val="num" w:pos="1440"/>
+        </w:tabs>
+        <w:ind w:left="1440" w:hanging="360"/>
+      </w:pPr>
+      <w:rPr>
+        <w:rFonts w:ascii="Courier New" w:hAnsi="Courier New" w:hint="default"/>
+        <w:sz w:val="20"/>
+      </w:rPr>
+    </w:lvl>
+    <w:lvl w:ilvl="2" w:tentative="1">
+      <w:start w:val="1"/>
+      <w:numFmt w:val="bullet"/>
+      <w:lvlText w:val=""/>
+      <w:lvlJc w:val="left"/>
+      <w:pPr>
+        <w:tabs>
+          <w:tab w:val="num" w:pos="2160"/>
+        </w:tabs>
+        <w:ind w:left="2160" w:hanging="360"/>
+      </w:pPr>
+      <w:rPr>
+        <w:rFonts w:ascii="Wingdings" w:hAnsi="Wingdings" w:hint="default"/>
+        <w:sz w:val="20"/>
+      </w:rPr>
+    </w:lvl>
+    <w:lvl w:ilvl="3" w:tentative="1">
+      <w:start w:val="1"/>
+      <w:numFmt w:val="bullet"/>
+      <w:lvlText w:val=""/>
+      <w:lvlJc w:val="left"/>
+      <w:pPr>
+        <w:tabs>
+          <w:tab w:val="num" w:pos="2880"/>
+        </w:tabs>
+        <w:ind w:left="2880" w:hanging="360"/>
+      </w:pPr>
+      <w:rPr>
+        <w:rFonts w:ascii="Wingdings" w:hAnsi="Wingdings" w:hint="default"/>
+        <w:sz w:val="20"/>
+      </w:rPr>
+    </w:lvl>
+    <w:lvl w:ilvl="4" w:tentative="1">
+      <w:start w:val="1"/>
+      <w:numFmt w:val="bullet"/>
+      <w:lvlText w:val=""/>
+      <w:lvlJc w:val="left"/>
+      <w:pPr>
+        <w:tabs>
+          <w:tab w:val="num" w:pos="3600"/>
+        </w:tabs>
+        <w:ind w:left="3600" w:hanging="360"/>
+      </w:pPr>
+      <w:rPr>
+        <w:rFonts w:ascii="Wingdings" w:hAnsi="Wingdings" w:hint="default"/>
+        <w:sz w:val="20"/>
+      </w:rPr>
+    </w:lvl>
+    <w:lvl w:ilvl="5" w:tentative="1">
+      <w:start w:val="1"/>
+      <w:numFmt w:val="bullet"/>
+      <w:lvlText w:val=""/>
+      <w:lvlJc w:val="left"/>
+      <w:pPr>
+        <w:tabs>
+          <w:tab w:val="num" w:pos="4320"/>
+        </w:tabs>
+        <w:ind w:left="4320" w:hanging="360"/>
+      </w:pPr>
+      <w:rPr>
+        <w:rFonts w:ascii="Wingdings" w:hAnsi="Wingdings" w:hint="default"/>
+        <w:sz w:val="20"/>
+      </w:rPr>
+    </w:lvl>
+    <w:lvl w:ilvl="6" w:tentative="1">
+      <w:start w:val="1"/>
+      <w:numFmt w:val="bullet"/>
+      <w:lvlText w:val=""/>
+      <w:lvlJc w:val="left"/>
+      <w:pPr>
+        <w:tabs>
+          <w:tab w:val="num" w:pos="5040"/>
+        </w:tabs>
+        <w:ind w:left="5040" w:hanging="360"/>
+      </w:pPr>
+      <w:rPr>
+        <w:rFonts w:ascii="Wingdings" w:hAnsi="Wingdings" w:hint="default"/>
+        <w:sz w:val="20"/>
+      </w:rPr>
+    </w:lvl>
+    <w:lvl w:ilvl="7" w:tentative="1">
+      <w:start w:val="1"/>
+      <w:numFmt w:val="bullet"/>
+      <w:lvlText w:val=""/>
+      <w:lvlJc w:val="left"/>
+      <w:pPr>
+        <w:tabs>
+          <w:tab w:val="num" w:pos="5760"/>
+        </w:tabs>
+        <w:ind w:left="5760" w:hanging="360"/>
+      </w:pPr>
+      <w:rPr>
+        <w:rFonts w:ascii="Wingdings" w:hAnsi="Wingdings" w:hint="default"/>
+        <w:sz w:val="20"/>
+      </w:rPr>
+    </w:lvl>
+    <w:lvl w:ilvl="8" w:tentative="1">
+      <w:start w:val="1"/>
+      <w:numFmt w:val="bullet"/>
+      <w:lvlText w:val=""/>
+      <w:lvlJc w:val="left"/>
+      <w:pPr>
+        <w:tabs>
+          <w:tab w:val="num" w:pos="6480"/>
+        </w:tabs>
+        <w:ind w:left="6480" w:hanging="360"/>
+      </w:pPr>
+      <w:rPr>
+        <w:rFonts w:ascii="Wingdings" w:hAnsi="Wingdings" w:hint="default"/>
+        <w:sz w:val="20"/>
+      </w:rPr>
+    </w:lvl>
+  </w:abstractNum>
+  <w:abstractNum w:abstractNumId="51" w15:restartNumberingAfterBreak="0">
     <w:nsid w:val="688A4375"/>
     <w:multiLevelType w:val="multilevel"/>
     <w:tmpl w:val="29364FF4"/>
@@ -14693,7 +17420,7 @@
       </w:pPr>
     </w:lvl>
   </w:abstractNum>
-  <w:abstractNum w:abstractNumId="48" w15:restartNumberingAfterBreak="0">
+  <w:abstractNum w:abstractNumId="52" w15:restartNumberingAfterBreak="0">
     <w:nsid w:val="6A9C1F2F"/>
     <w:multiLevelType w:val="multilevel"/>
     <w:tmpl w:val="28FA5E0A"/>
@@ -14842,7 +17569,7 @@
       </w:rPr>
     </w:lvl>
   </w:abstractNum>
-  <w:abstractNum w:abstractNumId="49" w15:restartNumberingAfterBreak="0">
+  <w:abstractNum w:abstractNumId="53" w15:restartNumberingAfterBreak="0">
     <w:nsid w:val="6DEB1D15"/>
     <w:multiLevelType w:val="multilevel"/>
     <w:tmpl w:val="E8DCF52E"/>
@@ -14958,7 +17685,7 @@
       </w:pPr>
     </w:lvl>
   </w:abstractNum>
-  <w:abstractNum w:abstractNumId="50" w15:restartNumberingAfterBreak="0">
+  <w:abstractNum w:abstractNumId="54" w15:restartNumberingAfterBreak="0">
     <w:nsid w:val="6EE10B1E"/>
     <w:multiLevelType w:val="multilevel"/>
     <w:tmpl w:val="38F0CC8E"/>
@@ -15107,7 +17834,7 @@
       </w:rPr>
     </w:lvl>
   </w:abstractNum>
-  <w:abstractNum w:abstractNumId="51" w15:restartNumberingAfterBreak="0">
+  <w:abstractNum w:abstractNumId="55" w15:restartNumberingAfterBreak="0">
     <w:nsid w:val="6EF9258B"/>
     <w:multiLevelType w:val="multilevel"/>
     <w:tmpl w:val="19265112"/>
@@ -15220,7 +17947,7 @@
       </w:pPr>
     </w:lvl>
   </w:abstractNum>
-  <w:abstractNum w:abstractNumId="52" w15:restartNumberingAfterBreak="0">
+  <w:abstractNum w:abstractNumId="56" w15:restartNumberingAfterBreak="0">
     <w:nsid w:val="71B903F2"/>
     <w:multiLevelType w:val="multilevel"/>
     <w:tmpl w:val="06540F5E"/>
@@ -15333,7 +18060,7 @@
       </w:pPr>
     </w:lvl>
   </w:abstractNum>
-  <w:abstractNum w:abstractNumId="53" w15:restartNumberingAfterBreak="0">
+  <w:abstractNum w:abstractNumId="57" w15:restartNumberingAfterBreak="0">
     <w:nsid w:val="72242EDC"/>
     <w:multiLevelType w:val="multilevel"/>
     <w:tmpl w:val="E0A26958"/>
@@ -15482,7 +18209,7 @@
       </w:rPr>
     </w:lvl>
   </w:abstractNum>
-  <w:abstractNum w:abstractNumId="54" w15:restartNumberingAfterBreak="0">
+  <w:abstractNum w:abstractNumId="58" w15:restartNumberingAfterBreak="0">
     <w:nsid w:val="745B1878"/>
     <w:multiLevelType w:val="multilevel"/>
     <w:tmpl w:val="D6E257CA"/>
@@ -15631,7 +18358,7 @@
       </w:rPr>
     </w:lvl>
   </w:abstractNum>
-  <w:abstractNum w:abstractNumId="55" w15:restartNumberingAfterBreak="0">
+  <w:abstractNum w:abstractNumId="59" w15:restartNumberingAfterBreak="0">
     <w:nsid w:val="75580956"/>
     <w:multiLevelType w:val="multilevel"/>
     <w:tmpl w:val="A32A19EC"/>
@@ -15744,7 +18471,7 @@
       </w:pPr>
     </w:lvl>
   </w:abstractNum>
-  <w:abstractNum w:abstractNumId="56" w15:restartNumberingAfterBreak="0">
+  <w:abstractNum w:abstractNumId="60" w15:restartNumberingAfterBreak="0">
     <w:nsid w:val="75C670AF"/>
     <w:multiLevelType w:val="multilevel"/>
     <w:tmpl w:val="9982892E"/>
@@ -15893,7 +18620,7 @@
       </w:rPr>
     </w:lvl>
   </w:abstractNum>
-  <w:abstractNum w:abstractNumId="57" w15:restartNumberingAfterBreak="0">
+  <w:abstractNum w:abstractNumId="61" w15:restartNumberingAfterBreak="0">
     <w:nsid w:val="76B6020E"/>
     <w:multiLevelType w:val="multilevel"/>
     <w:tmpl w:val="F092CD7E"/>
@@ -16006,7 +18733,156 @@
       </w:pPr>
     </w:lvl>
   </w:abstractNum>
-  <w:abstractNum w:abstractNumId="58" w15:restartNumberingAfterBreak="0">
+  <w:abstractNum w:abstractNumId="62" w15:restartNumberingAfterBreak="0">
+    <w:nsid w:val="78EC3E51"/>
+    <w:multiLevelType w:val="multilevel"/>
+    <w:tmpl w:val="C5165AB8"/>
+    <w:lvl w:ilvl="0">
+      <w:start w:val="1"/>
+      <w:numFmt w:val="bullet"/>
+      <w:lvlText w:val=""/>
+      <w:lvlJc w:val="left"/>
+      <w:pPr>
+        <w:tabs>
+          <w:tab w:val="num" w:pos="720"/>
+        </w:tabs>
+        <w:ind w:left="720" w:hanging="360"/>
+      </w:pPr>
+      <w:rPr>
+        <w:rFonts w:ascii="Symbol" w:hAnsi="Symbol" w:hint="default"/>
+        <w:sz w:val="20"/>
+      </w:rPr>
+    </w:lvl>
+    <w:lvl w:ilvl="1" w:tentative="1">
+      <w:start w:val="1"/>
+      <w:numFmt w:val="bullet"/>
+      <w:lvlText w:val="o"/>
+      <w:lvlJc w:val="left"/>
+      <w:pPr>
+        <w:tabs>
+          <w:tab w:val="num" w:pos="1440"/>
+        </w:tabs>
+        <w:ind w:left="1440" w:hanging="360"/>
+      </w:pPr>
+      <w:rPr>
+        <w:rFonts w:ascii="Courier New" w:hAnsi="Courier New" w:hint="default"/>
+        <w:sz w:val="20"/>
+      </w:rPr>
+    </w:lvl>
+    <w:lvl w:ilvl="2" w:tentative="1">
+      <w:start w:val="1"/>
+      <w:numFmt w:val="bullet"/>
+      <w:lvlText w:val=""/>
+      <w:lvlJc w:val="left"/>
+      <w:pPr>
+        <w:tabs>
+          <w:tab w:val="num" w:pos="2160"/>
+        </w:tabs>
+        <w:ind w:left="2160" w:hanging="360"/>
+      </w:pPr>
+      <w:rPr>
+        <w:rFonts w:ascii="Wingdings" w:hAnsi="Wingdings" w:hint="default"/>
+        <w:sz w:val="20"/>
+      </w:rPr>
+    </w:lvl>
+    <w:lvl w:ilvl="3" w:tentative="1">
+      <w:start w:val="1"/>
+      <w:numFmt w:val="bullet"/>
+      <w:lvlText w:val=""/>
+      <w:lvlJc w:val="left"/>
+      <w:pPr>
+        <w:tabs>
+          <w:tab w:val="num" w:pos="2880"/>
+        </w:tabs>
+        <w:ind w:left="2880" w:hanging="360"/>
+      </w:pPr>
+      <w:rPr>
+        <w:rFonts w:ascii="Wingdings" w:hAnsi="Wingdings" w:hint="default"/>
+        <w:sz w:val="20"/>
+      </w:rPr>
+    </w:lvl>
+    <w:lvl w:ilvl="4" w:tentative="1">
+      <w:start w:val="1"/>
+      <w:numFmt w:val="bullet"/>
+      <w:lvlText w:val=""/>
+      <w:lvlJc w:val="left"/>
+      <w:pPr>
+        <w:tabs>
+          <w:tab w:val="num" w:pos="3600"/>
+        </w:tabs>
+        <w:ind w:left="3600" w:hanging="360"/>
+      </w:pPr>
+      <w:rPr>
+        <w:rFonts w:ascii="Wingdings" w:hAnsi="Wingdings" w:hint="default"/>
+        <w:sz w:val="20"/>
+      </w:rPr>
+    </w:lvl>
+    <w:lvl w:ilvl="5" w:tentative="1">
+      <w:start w:val="1"/>
+      <w:numFmt w:val="bullet"/>
+      <w:lvlText w:val=""/>
+      <w:lvlJc w:val="left"/>
+      <w:pPr>
+        <w:tabs>
+          <w:tab w:val="num" w:pos="4320"/>
+        </w:tabs>
+        <w:ind w:left="4320" w:hanging="360"/>
+      </w:pPr>
+      <w:rPr>
+        <w:rFonts w:ascii="Wingdings" w:hAnsi="Wingdings" w:hint="default"/>
+        <w:sz w:val="20"/>
+      </w:rPr>
+    </w:lvl>
+    <w:lvl w:ilvl="6" w:tentative="1">
+      <w:start w:val="1"/>
+      <w:numFmt w:val="bullet"/>
+      <w:lvlText w:val=""/>
+      <w:lvlJc w:val="left"/>
+      <w:pPr>
+        <w:tabs>
+          <w:tab w:val="num" w:pos="5040"/>
+        </w:tabs>
+        <w:ind w:left="5040" w:hanging="360"/>
+      </w:pPr>
+      <w:rPr>
+        <w:rFonts w:ascii="Wingdings" w:hAnsi="Wingdings" w:hint="default"/>
+        <w:sz w:val="20"/>
+      </w:rPr>
+    </w:lvl>
+    <w:lvl w:ilvl="7" w:tentative="1">
+      <w:start w:val="1"/>
+      <w:numFmt w:val="bullet"/>
+      <w:lvlText w:val=""/>
+      <w:lvlJc w:val="left"/>
+      <w:pPr>
+        <w:tabs>
+          <w:tab w:val="num" w:pos="5760"/>
+        </w:tabs>
+        <w:ind w:left="5760" w:hanging="360"/>
+      </w:pPr>
+      <w:rPr>
+        <w:rFonts w:ascii="Wingdings" w:hAnsi="Wingdings" w:hint="default"/>
+        <w:sz w:val="20"/>
+      </w:rPr>
+    </w:lvl>
+    <w:lvl w:ilvl="8" w:tentative="1">
+      <w:start w:val="1"/>
+      <w:numFmt w:val="bullet"/>
+      <w:lvlText w:val=""/>
+      <w:lvlJc w:val="left"/>
+      <w:pPr>
+        <w:tabs>
+          <w:tab w:val="num" w:pos="6480"/>
+        </w:tabs>
+        <w:ind w:left="6480" w:hanging="360"/>
+      </w:pPr>
+      <w:rPr>
+        <w:rFonts w:ascii="Wingdings" w:hAnsi="Wingdings" w:hint="default"/>
+        <w:sz w:val="20"/>
+      </w:rPr>
+    </w:lvl>
+  </w:abstractNum>
+  <w:abstractNum w:abstractNumId="63" w15:restartNumberingAfterBreak="0">
     <w:nsid w:val="7A473F29"/>
     <w:multiLevelType w:val="multilevel"/>
     <w:tmpl w:val="7806F180"/>
@@ -16119,7 +18995,7 @@
       </w:pPr>
     </w:lvl>
   </w:abstractNum>
-  <w:abstractNum w:abstractNumId="59" w15:restartNumberingAfterBreak="0">
+  <w:abstractNum w:abstractNumId="64" w15:restartNumberingAfterBreak="0">
     <w:nsid w:val="7A6C5CAA"/>
     <w:multiLevelType w:val="multilevel"/>
     <w:tmpl w:val="76F4024C"/>
@@ -16268,7 +19144,7 @@
       </w:rPr>
     </w:lvl>
   </w:abstractNum>
-  <w:abstractNum w:abstractNumId="60" w15:restartNumberingAfterBreak="0">
+  <w:abstractNum w:abstractNumId="65" w15:restartNumberingAfterBreak="0">
     <w:nsid w:val="7A6F3529"/>
     <w:multiLevelType w:val="multilevel"/>
     <w:tmpl w:val="27A664C6"/>
@@ -16381,7 +19257,7 @@
       </w:pPr>
     </w:lvl>
   </w:abstractNum>
-  <w:abstractNum w:abstractNumId="61" w15:restartNumberingAfterBreak="0">
+  <w:abstractNum w:abstractNumId="66" w15:restartNumberingAfterBreak="0">
     <w:nsid w:val="7C0929A5"/>
     <w:multiLevelType w:val="multilevel"/>
     <w:tmpl w:val="D5223598"/>
@@ -16494,7 +19370,7 @@
       </w:pPr>
     </w:lvl>
   </w:abstractNum>
-  <w:abstractNum w:abstractNumId="62" w15:restartNumberingAfterBreak="0">
+  <w:abstractNum w:abstractNumId="67" w15:restartNumberingAfterBreak="0">
     <w:nsid w:val="7F3901F4"/>
     <w:multiLevelType w:val="hybridMultilevel"/>
     <w:tmpl w:val="5C208D0C"/>
@@ -16607,7 +19483,7 @@
       </w:rPr>
     </w:lvl>
   </w:abstractNum>
-  <w:abstractNum w:abstractNumId="63" w15:restartNumberingAfterBreak="0">
+  <w:abstractNum w:abstractNumId="68" w15:restartNumberingAfterBreak="0">
     <w:nsid w:val="7FD13E9E"/>
     <w:multiLevelType w:val="hybridMultilevel"/>
     <w:tmpl w:val="CFA8D65A"/>
@@ -16721,10 +19597,10 @@
     </w:lvl>
   </w:abstractNum>
   <w:num w:numId="1" w16cid:durableId="1595934346">
-    <w:abstractNumId w:val="41"/>
+    <w:abstractNumId w:val="43"/>
   </w:num>
   <w:num w:numId="2" w16cid:durableId="1289824026">
-    <w:abstractNumId w:val="47"/>
+    <w:abstractNumId w:val="51"/>
   </w:num>
   <w:num w:numId="3" w16cid:durableId="1495414839">
     <w:abstractNumId w:val="16"/>
@@ -16736,79 +19612,79 @@
     <w:abstractNumId w:val="7"/>
   </w:num>
   <w:num w:numId="6" w16cid:durableId="743840048">
-    <w:abstractNumId w:val="61"/>
+    <w:abstractNumId w:val="66"/>
   </w:num>
   <w:num w:numId="7" w16cid:durableId="886987099">
     <w:abstractNumId w:val="20"/>
   </w:num>
   <w:num w:numId="8" w16cid:durableId="1703164690">
-    <w:abstractNumId w:val="35"/>
+    <w:abstractNumId w:val="37"/>
   </w:num>
   <w:num w:numId="9" w16cid:durableId="2140144743">
-    <w:abstractNumId w:val="29"/>
+    <w:abstractNumId w:val="30"/>
   </w:num>
   <w:num w:numId="10" w16cid:durableId="1377192877">
-    <w:abstractNumId w:val="63"/>
+    <w:abstractNumId w:val="68"/>
   </w:num>
   <w:num w:numId="11" w16cid:durableId="1584685546">
     <w:abstractNumId w:val="9"/>
   </w:num>
   <w:num w:numId="12" w16cid:durableId="872497855">
-    <w:abstractNumId w:val="46"/>
+    <w:abstractNumId w:val="49"/>
   </w:num>
   <w:num w:numId="13" w16cid:durableId="336348946">
     <w:abstractNumId w:val="14"/>
   </w:num>
   <w:num w:numId="14" w16cid:durableId="1329216667">
-    <w:abstractNumId w:val="27"/>
+    <w:abstractNumId w:val="28"/>
   </w:num>
   <w:num w:numId="15" w16cid:durableId="1958020200">
-    <w:abstractNumId w:val="53"/>
+    <w:abstractNumId w:val="57"/>
   </w:num>
   <w:num w:numId="16" w16cid:durableId="371156247">
-    <w:abstractNumId w:val="62"/>
+    <w:abstractNumId w:val="67"/>
   </w:num>
   <w:num w:numId="17" w16cid:durableId="1887644536">
-    <w:abstractNumId w:val="34"/>
+    <w:abstractNumId w:val="36"/>
   </w:num>
   <w:num w:numId="18" w16cid:durableId="1281572027">
     <w:abstractNumId w:val="8"/>
   </w:num>
   <w:num w:numId="19" w16cid:durableId="1886212286">
-    <w:abstractNumId w:val="33"/>
+    <w:abstractNumId w:val="35"/>
   </w:num>
   <w:num w:numId="20" w16cid:durableId="1832452566">
     <w:abstractNumId w:val="18"/>
   </w:num>
   <w:num w:numId="21" w16cid:durableId="556163960">
+    <w:abstractNumId w:val="24"/>
+  </w:num>
+  <w:num w:numId="22" w16cid:durableId="2012172334">
+    <w:abstractNumId w:val="22"/>
+  </w:num>
+  <w:num w:numId="23" w16cid:durableId="1576739145">
+    <w:abstractNumId w:val="27"/>
+  </w:num>
+  <w:num w:numId="24" w16cid:durableId="1829665961">
+    <w:abstractNumId w:val="61"/>
+  </w:num>
+  <w:num w:numId="25" w16cid:durableId="1860269174">
+    <w:abstractNumId w:val="48"/>
+  </w:num>
+  <w:num w:numId="26" w16cid:durableId="145246631">
     <w:abstractNumId w:val="23"/>
   </w:num>
-  <w:num w:numId="22" w16cid:durableId="2012172334">
-    <w:abstractNumId w:val="21"/>
+  <w:num w:numId="27" w16cid:durableId="999576947">
+    <w:abstractNumId w:val="34"/>
   </w:num>
-  <w:num w:numId="23" w16cid:durableId="1576739145">
-    <w:abstractNumId w:val="26"/>
-  </w:num>
-  <w:num w:numId="24" w16cid:durableId="1829665961">
-    <w:abstractNumId w:val="57"/>
-  </w:num>
-  <w:num w:numId="25" w16cid:durableId="1860269174">
+  <w:num w:numId="28" w16cid:durableId="1070616183">
     <w:abstractNumId w:val="45"/>
   </w:num>
-  <w:num w:numId="26" w16cid:durableId="145246631">
-    <w:abstractNumId w:val="22"/>
-  </w:num>
-  <w:num w:numId="27" w16cid:durableId="999576947">
-    <w:abstractNumId w:val="32"/>
-  </w:num>
-  <w:num w:numId="28" w16cid:durableId="1070616183">
-    <w:abstractNumId w:val="43"/>
-  </w:num>
   <w:num w:numId="29" w16cid:durableId="441607359">
-    <w:abstractNumId w:val="56"/>
+    <w:abstractNumId w:val="60"/>
   </w:num>
   <w:num w:numId="30" w16cid:durableId="54554231">
-    <w:abstractNumId w:val="37"/>
+    <w:abstractNumId w:val="39"/>
   </w:num>
   <w:num w:numId="31" w16cid:durableId="135487474">
     <w:abstractNumId w:val="5"/>
@@ -16829,37 +19705,37 @@
     <w:abstractNumId w:val="6"/>
   </w:num>
   <w:num w:numId="37" w16cid:durableId="1853449910">
+    <w:abstractNumId w:val="44"/>
+  </w:num>
+  <w:num w:numId="38" w16cid:durableId="877356645">
+    <w:abstractNumId w:val="58"/>
+  </w:num>
+  <w:num w:numId="39" w16cid:durableId="271858837">
+    <w:abstractNumId w:val="29"/>
+  </w:num>
+  <w:num w:numId="40" w16cid:durableId="822431231">
+    <w:abstractNumId w:val="38"/>
+  </w:num>
+  <w:num w:numId="41" w16cid:durableId="531260196">
+    <w:abstractNumId w:val="40"/>
+  </w:num>
+  <w:num w:numId="42" w16cid:durableId="768280480">
     <w:abstractNumId w:val="42"/>
   </w:num>
-  <w:num w:numId="38" w16cid:durableId="877356645">
-    <w:abstractNumId w:val="54"/>
-  </w:num>
-  <w:num w:numId="39" w16cid:durableId="271858837">
-    <w:abstractNumId w:val="28"/>
-  </w:num>
-  <w:num w:numId="40" w16cid:durableId="822431231">
-    <w:abstractNumId w:val="36"/>
-  </w:num>
-  <w:num w:numId="41" w16cid:durableId="531260196">
-    <w:abstractNumId w:val="38"/>
-  </w:num>
-  <w:num w:numId="42" w16cid:durableId="768280480">
-    <w:abstractNumId w:val="40"/>
-  </w:num>
   <w:num w:numId="43" w16cid:durableId="1483544294">
-    <w:abstractNumId w:val="58"/>
+    <w:abstractNumId w:val="63"/>
   </w:num>
   <w:num w:numId="44" w16cid:durableId="988557325">
-    <w:abstractNumId w:val="60"/>
+    <w:abstractNumId w:val="65"/>
   </w:num>
   <w:num w:numId="45" w16cid:durableId="1821270753">
-    <w:abstractNumId w:val="24"/>
+    <w:abstractNumId w:val="25"/>
   </w:num>
   <w:num w:numId="46" w16cid:durableId="1723401757">
-    <w:abstractNumId w:val="55"/>
+    <w:abstractNumId w:val="59"/>
   </w:num>
   <w:num w:numId="47" w16cid:durableId="453982592">
-    <w:abstractNumId w:val="30"/>
+    <w:abstractNumId w:val="31"/>
   </w:num>
   <w:num w:numId="48" w16cid:durableId="1862625260">
     <w:abstractNumId w:val="12"/>
@@ -16868,22 +19744,22 @@
     <w:abstractNumId w:val="17"/>
   </w:num>
   <w:num w:numId="50" w16cid:durableId="203449042">
-    <w:abstractNumId w:val="48"/>
+    <w:abstractNumId w:val="52"/>
   </w:num>
   <w:num w:numId="51" w16cid:durableId="1860580794">
-    <w:abstractNumId w:val="50"/>
+    <w:abstractNumId w:val="54"/>
   </w:num>
   <w:num w:numId="52" w16cid:durableId="1516965771">
-    <w:abstractNumId w:val="44"/>
+    <w:abstractNumId w:val="47"/>
   </w:num>
   <w:num w:numId="53" w16cid:durableId="901063694">
-    <w:abstractNumId w:val="49"/>
+    <w:abstractNumId w:val="53"/>
   </w:num>
   <w:num w:numId="54" w16cid:durableId="1334334227">
-    <w:abstractNumId w:val="31"/>
+    <w:abstractNumId w:val="32"/>
   </w:num>
   <w:num w:numId="55" w16cid:durableId="896863322">
-    <w:abstractNumId w:val="25"/>
+    <w:abstractNumId w:val="26"/>
   </w:num>
   <w:num w:numId="56" w16cid:durableId="1254434328">
     <w:abstractNumId w:val="1"/>
@@ -16895,22 +19771,37 @@
     <w:abstractNumId w:val="11"/>
   </w:num>
   <w:num w:numId="59" w16cid:durableId="885406808">
-    <w:abstractNumId w:val="59"/>
+    <w:abstractNumId w:val="64"/>
   </w:num>
   <w:num w:numId="60" w16cid:durableId="1770202793">
-    <w:abstractNumId w:val="52"/>
+    <w:abstractNumId w:val="56"/>
   </w:num>
   <w:num w:numId="61" w16cid:durableId="626938191">
     <w:abstractNumId w:val="13"/>
   </w:num>
   <w:num w:numId="62" w16cid:durableId="1378820794">
-    <w:abstractNumId w:val="51"/>
+    <w:abstractNumId w:val="55"/>
   </w:num>
   <w:num w:numId="63" w16cid:durableId="1087119841">
-    <w:abstractNumId w:val="39"/>
+    <w:abstractNumId w:val="41"/>
   </w:num>
   <w:num w:numId="64" w16cid:durableId="1455441454">
     <w:abstractNumId w:val="2"/>
+  </w:num>
+  <w:num w:numId="65" w16cid:durableId="918948424">
+    <w:abstractNumId w:val="21"/>
+  </w:num>
+  <w:num w:numId="66" w16cid:durableId="776868729">
+    <w:abstractNumId w:val="50"/>
+  </w:num>
+  <w:num w:numId="67" w16cid:durableId="1684865151">
+    <w:abstractNumId w:val="62"/>
+  </w:num>
+  <w:num w:numId="68" w16cid:durableId="1153642692">
+    <w:abstractNumId w:val="33"/>
+  </w:num>
+  <w:num w:numId="69" w16cid:durableId="218320793">
+    <w:abstractNumId w:val="46"/>
   </w:num>
 </w:numbering>
 </file>
@@ -17515,7 +20406,6 @@
   <w:style w:type="character" w:default="1" w:styleId="Fontepargpadro">
     <w:name w:val="Default Paragraph Font"/>
     <w:uiPriority w:val="1"/>
-    <w:semiHidden/>
     <w:unhideWhenUsed/>
   </w:style>
   <w:style w:type="table" w:default="1" w:styleId="Tabelanormal">

</xml_diff>